<commit_message>
Fix docs report assets
</commit_message>
<xml_diff>
--- a/docs/these_brieuc_last_recueil.docx
+++ b/docs/these_brieuc_last_recueil.docx
@@ -2128,7 +2128,7 @@
       </w:r>
     </w:p>
     <w:bookmarkEnd w:id="29"/>
-    <w:bookmarkStart w:id="168" w:name="résultats"/>
+    <w:bookmarkStart w:id="170" w:name="résultats"/>
     <w:p>
       <w:pPr>
         <w:pStyle w:val="Heading1"/>
@@ -11417,7 +11417,7 @@
       </w:r>
     </w:p>
     <w:bookmarkEnd w:id="95"/>
-    <w:bookmarkStart w:id="112" w:name="combinaisons-et-score-de-positivité-ulnt"/>
+    <w:bookmarkStart w:id="114" w:name="combinaisons-et-score-de-positivité-ulnt"/>
     <w:p>
       <w:pPr>
         <w:pStyle w:val="Heading2"/>
@@ -13627,7 +13627,7 @@
       </w:r>
     </w:p>
     <w:bookmarkEnd w:id="96"/>
-    <w:bookmarkStart w:id="111" w:name="X03dbcbbf9db0121bf925d0d666616bf3a5f62d7"/>
+    <w:bookmarkStart w:id="113" w:name="X03dbcbbf9db0121bf925d0d666616bf3a5f62d7"/>
     <w:p>
       <w:pPr>
         <w:pStyle w:val="Heading3"/>
@@ -14817,7 +14817,7 @@
       </w:r>
     </w:p>
     <w:bookmarkEnd w:id="100"/>
-    <w:bookmarkStart w:id="110" w:name="gain-de-spécificité"/>
+    <w:bookmarkStart w:id="112" w:name="gain-de-spécificité"/>
     <w:p>
       <w:pPr>
         <w:pStyle w:val="Heading4"/>
@@ -15391,63 +15391,153 @@
         <w:t xml:space="preserve">Courbe ROC du score global (Nombre de tests positifs)</w:t>
       </w:r>
     </w:p>
-    <w:p>
-      <w:pPr>
-        <w:pStyle w:val="BodyText"/>
-      </w:pPr>
-      <w:r>
-        <w:t xml:space="preserve">::: {. callout-important title=</w:t>
-      </w:r>
-      <w:r>
-        <w:t xml:space="preserve">“ATTENTION BRIEUC”</w:t>
-      </w:r>
-      <w:r>
-        <w:t xml:space="preserve">}</w:t>
-      </w:r>
-      <w:r>
-        <w:t xml:space="preserve"> </w:t>
-      </w:r>
-      <w:r>
-        <w:t xml:space="preserve">- Les courbes ROC c’est vraiment pas terrible pour un score discret (c’est à dire uniquement des nombres entiers)</w:t>
-      </w:r>
-    </w:p>
-    <w:p>
-      <w:pPr>
-        <w:numPr>
-          <w:ilvl w:val="0"/>
-          <w:numId w:val="1031"/>
-        </w:numPr>
-      </w:pPr>
-      <w:r>
-        <w:t xml:space="preserve">Donc pas très joli : je le mettrais pas</w:t>
-      </w:r>
-    </w:p>
-    <w:p>
-      <w:pPr>
-        <w:numPr>
-          <w:ilvl w:val="0"/>
-          <w:numId w:val="1031"/>
-        </w:numPr>
-      </w:pPr>
-      <w:r>
-        <w:t xml:space="preserve">ÇA VA C’EST ÉCRIT ASSEZ GROS ??</w:t>
-      </w:r>
-      <w:r>
-        <w:t xml:space="preserve"> </w:t>
-      </w:r>
-      <w:r>
-        <w:t xml:space="preserve">:::</w:t>
-      </w:r>
-    </w:p>
+    <w:tbl>
+      <w:tblPr>
+        <w:tblStyle w:val="Table"/>
+        <w:tblLook w:firstRow="0" w:lastRow="0" w:firstColumn="0" w:lastColumn="0" w:noHBand="0" w:noVBand="0" w:val="0000"/>
+        <w:tblBorders>
+          <w:top w:val="single" w:sz="4" w:space="0" w:color="CC1914"/>
+          <w:left w:val="single" w:sz="24" w:space="0" w:color="CC1914"/>
+          <w:bottom w:val="single" w:sz="4" w:space="0" w:color="CC1914"/>
+          <w:right w:val="single" w:sz="4" w:space="0" w:color="CC1914"/>
+        </w:tblBorders>
+        <w:tblCellMar>
+          <w:left w:w="144" w:type="dxa"/>
+          <w:right w:w="144" w:type="dxa"/>
+        </w:tblCellMar>
+        <w:tblLook w:firstRow="0" w:lastRow="0" w:firstColumn="0" w:lastColumn="0" w:noHBand="0" w:noVBand="0" w:val="0000"/>
+      </w:tblPr>
+      <w:tr>
+        <w:trPr>
+          <w:cantSplit/>
+        </w:trPr>
+        <w:tc>
+          <w:tcPr>
+            <w:shd w:color="auto" w:fill="f7dddc" w:val="clear"/>
+            <w:tcMar>
+              <w:top w:w="92" w:type="dxa"/>
+              <w:bottom w:w="92" w:type="dxa"/>
+            </w:tcMar>
+          </w:tcPr>
+          <w:p>
+            <w:pPr>
+              <w:pStyle w:val="BodyText"/>
+            </w:pPr>
+            <w:pPr>
+              <w:spacing w:before="0" w:after="0"/>
+              <w:textAlignment w:val="center"/>
+            </w:pPr>
+            <w:r>
+              <w:drawing>
+                <wp:inline>
+                  <wp:extent cx="152400" cy="152400"/>
+                  <wp:effectExtent b="0" l="0" r="0" t="0"/>
+                  <wp:docPr descr="" title="" id="110" name="Picture"/>
+                  <a:graphic>
+                    <a:graphicData uri="http://schemas.openxmlformats.org/drawingml/2006/picture">
+                      <pic:pic>
+                        <pic:nvPicPr>
+                          <pic:cNvPr descr="/Applications/quarto/share/formats/docx/important.png" id="111" name="Picture"/>
+                          <pic:cNvPicPr>
+                            <a:picLocks noChangeArrowheads="1" noChangeAspect="1"/>
+                          </pic:cNvPicPr>
+                        </pic:nvPicPr>
+                        <pic:blipFill>
+                          <a:blip r:embed="rId65"/>
+                          <a:stretch>
+                            <a:fillRect/>
+                          </a:stretch>
+                        </pic:blipFill>
+                        <pic:spPr bwMode="auto">
+                          <a:xfrm>
+                            <a:off x="0" y="0"/>
+                            <a:ext cx="152400" cy="152400"/>
+                          </a:xfrm>
+                          <a:prstGeom prst="rect">
+                            <a:avLst/>
+                          </a:prstGeom>
+                          <a:noFill/>
+                          <a:ln w="9525">
+                            <a:noFill/>
+                            <a:headEnd/>
+                            <a:tailEnd/>
+                          </a:ln>
+                        </pic:spPr>
+                      </pic:pic>
+                    </a:graphicData>
+                  </a:graphic>
+                </wp:inline>
+              </w:drawing>
+            </w:r>
+            <w:r>
+              <w:t xml:space="preserve"> </w:t>
+            </w:r>
+            <w:r>
+              <w:t xml:space="preserve"> </w:t>
+            </w:r>
+            <w:r>
+              <w:t xml:space="preserve">ATTENTION BRIEUC</w:t>
+            </w:r>
+          </w:p>
+        </w:tc>
+      </w:tr>
+      <w:tr>
+        <w:trPr>
+          <w:cantSplit/>
+        </w:trPr>
+        <w:tc>
+          <w:tcPr>
+            <w:tcMar>
+              <w:top w:w="108" w:type="dxa"/>
+              <w:bottom w:w="108" w:type="dxa"/>
+            </w:tcMar>
+          </w:tcPr>
+          <w:p>
+            <w:pPr>
+              <w:numPr>
+                <w:ilvl w:val="0"/>
+                <w:numId w:val="1031"/>
+              </w:numPr>
+            </w:pPr>
+            <w:r>
+              <w:t xml:space="preserve">Les courbes ROC c’est vraiment pas terrible pour un score discret (c’est à dire uniquement des nombres entiers)</w:t>
+            </w:r>
+          </w:p>
+          <w:p>
+            <w:pPr>
+              <w:numPr>
+                <w:ilvl w:val="0"/>
+                <w:numId w:val="1031"/>
+              </w:numPr>
+            </w:pPr>
+            <w:r>
+              <w:t xml:space="preserve">Donc pas très joli : je le mettrais pas</w:t>
+            </w:r>
+          </w:p>
+          <w:p>
+            <w:pPr>
+              <w:numPr>
+                <w:ilvl w:val="0"/>
+                <w:numId w:val="1031"/>
+              </w:numPr>
+            </w:pPr>
+            <w:r>
+              <w:t xml:space="preserve">ÇA VA C’EST ÉCRIT ASSEZ GROS ??</w:t>
+            </w:r>
+          </w:p>
+          <w:p/>
+        </w:tc>
+      </w:tr>
+    </w:tbl>
     <w:p>
       <w:r>
         <w:br w:type="page"/>
       </w:r>
     </w:p>
-    <w:bookmarkEnd w:id="110"/>
-    <w:bookmarkEnd w:id="111"/>
     <w:bookmarkEnd w:id="112"/>
-    <w:bookmarkStart w:id="140" w:name="Xd9c2445cfe2dcec6a85ff49d15ae9240c0cf3af"/>
+    <w:bookmarkEnd w:id="113"/>
+    <w:bookmarkEnd w:id="114"/>
+    <w:bookmarkStart w:id="142" w:name="Xd9c2445cfe2dcec6a85ff49d15ae9240c0cf3af"/>
     <w:p>
       <w:pPr>
         <w:pStyle w:val="Heading2"/>
@@ -15464,7 +15554,7 @@
         <w:t xml:space="preserve">Résultats par niveau métamérique, exploratoires du fait des effectifs très faibles à certains niveaux.</w:t>
       </w:r>
     </w:p>
-    <w:bookmarkStart w:id="119" w:name="résumé-descriptif-par-niveau-métamérique"/>
+    <w:bookmarkStart w:id="121" w:name="résumé-descriptif-par-niveau-métamérique"/>
     <w:p>
       <w:pPr>
         <w:pStyle w:val="Heading3"/>
@@ -15954,18 +16044,18 @@
           <wp:inline>
             <wp:extent cx="5334000" cy="4267200"/>
             <wp:effectExtent b="0" l="0" r="0" t="0"/>
-            <wp:docPr descr="Effectif de NCB par niveau métamérique" title="" id="114" name="Picture"/>
+            <wp:docPr descr="Effectif de NCB par niveau métamérique" title="" id="116" name="Picture"/>
             <a:graphic>
               <a:graphicData uri="http://schemas.openxmlformats.org/drawingml/2006/picture">
                 <pic:pic>
                   <pic:nvPicPr>
-                    <pic:cNvPr descr="these_brieuc_last_recueil_files/figure-docx/results-by-level-rate-1.png" id="115" name="Picture"/>
+                    <pic:cNvPr descr="these_brieuc_last_recueil_files/figure-docx/results-by-level-rate-1.png" id="117" name="Picture"/>
                     <pic:cNvPicPr>
                       <a:picLocks noChangeArrowheads="1" noChangeAspect="1"/>
                     </pic:cNvPicPr>
                   </pic:nvPicPr>
                   <pic:blipFill>
-                    <a:blip r:embed="rId113"/>
+                    <a:blip r:embed="rId115"/>
                     <a:stretch>
                       <a:fillRect/>
                     </a:stretch>
@@ -16009,18 +16099,18 @@
           <wp:inline>
             <wp:extent cx="5334000" cy="4267200"/>
             <wp:effectExtent b="0" l="0" r="0" t="0"/>
-            <wp:docPr descr="Distribution du score ULNT selon le niveau métamérique" title="" id="117" name="Picture"/>
+            <wp:docPr descr="Distribution du score ULNT selon le niveau métamérique" title="" id="119" name="Picture"/>
             <a:graphic>
               <a:graphicData uri="http://schemas.openxmlformats.org/drawingml/2006/picture">
                 <pic:pic>
                   <pic:nvPicPr>
-                    <pic:cNvPr descr="these_brieuc_last_recueil_files/figure-docx/results-by-level-count-1.png" id="118" name="Picture"/>
+                    <pic:cNvPr descr="these_brieuc_last_recueil_files/figure-docx/results-by-level-count-1.png" id="120" name="Picture"/>
                     <pic:cNvPicPr>
                       <a:picLocks noChangeArrowheads="1" noChangeAspect="1"/>
                     </pic:cNvPicPr>
                   </pic:nvPicPr>
                   <pic:blipFill>
-                    <a:blip r:embed="rId116"/>
+                    <a:blip r:embed="rId118"/>
                     <a:stretch>
                       <a:fillRect/>
                     </a:stretch>
@@ -16152,8 +16242,8 @@
         <w:br w:type="page"/>
       </w:r>
     </w:p>
-    <w:bookmarkEnd w:id="119"/>
-    <w:bookmarkStart w:id="128" w:name="X24df2f30bf32bdef8b2f19a40875147e62cc664"/>
+    <w:bookmarkEnd w:id="121"/>
+    <w:bookmarkStart w:id="130" w:name="X24df2f30bf32bdef8b2f19a40875147e62cc664"/>
     <w:p>
       <w:pPr>
         <w:pStyle w:val="Heading3"/>
@@ -16183,7 +16273,7 @@
       <w:tr>
         <w:tc>
           <w:tcPr/>
-          <w:bookmarkStart w:id="123" w:name="fig-gs-positive-level"/>
+          <w:bookmarkStart w:id="125" w:name="fig-gs-positive-level"/>
           <w:p>
             <w:pPr>
               <w:pStyle w:val="Compact"/>
@@ -16194,18 +16284,18 @@
                 <wp:inline>
                   <wp:extent cx="5334000" cy="4267200"/>
                   <wp:effectExtent b="0" l="0" r="0" t="0"/>
-                  <wp:docPr descr="" title="" id="121" name="Picture"/>
+                  <wp:docPr descr="" title="" id="123" name="Picture"/>
                   <a:graphic>
                     <a:graphicData uri="http://schemas.openxmlformats.org/drawingml/2006/picture">
                       <pic:pic>
                         <pic:nvPicPr>
-                          <pic:cNvPr descr="these_brieuc_last_recueil_files/figure-docx/fig-gs-positive-level-1.png" id="122" name="Picture"/>
+                          <pic:cNvPr descr="these_brieuc_last_recueil_files/figure-docx/fig-gs-positive-level-1.png" id="124" name="Picture"/>
                           <pic:cNvPicPr>
                             <a:picLocks noChangeArrowheads="1" noChangeAspect="1"/>
                           </pic:cNvPicPr>
                         </pic:nvPicPr>
                         <pic:blipFill>
-                          <a:blip r:embed="rId120"/>
+                          <a:blip r:embed="rId122"/>
                           <a:stretch>
                             <a:fillRect/>
                           </a:stretch>
@@ -16245,7 +16335,7 @@
               <w:t xml:space="preserve">Figure 2: Répartition des niveaux métamériques uniquement chez les cas confirmés</w:t>
             </w:r>
           </w:p>
-          <w:bookmarkEnd w:id="123"/>
+          <w:bookmarkEnd w:id="125"/>
         </w:tc>
       </w:tr>
     </w:tbl>
@@ -16262,7 +16352,7 @@
       <w:tr>
         <w:tc>
           <w:tcPr/>
-          <w:bookmarkStart w:id="127" w:name="fig-gs-positive-score"/>
+          <w:bookmarkStart w:id="129" w:name="fig-gs-positive-score"/>
           <w:p>
             <w:pPr>
               <w:pStyle w:val="Compact"/>
@@ -16273,18 +16363,18 @@
                 <wp:inline>
                   <wp:extent cx="5334000" cy="4267200"/>
                   <wp:effectExtent b="0" l="0" r="0" t="0"/>
-                  <wp:docPr descr="" title="" id="125" name="Picture"/>
+                  <wp:docPr descr="" title="" id="127" name="Picture"/>
                   <a:graphic>
                     <a:graphicData uri="http://schemas.openxmlformats.org/drawingml/2006/picture">
                       <pic:pic>
                         <pic:nvPicPr>
-                          <pic:cNvPr descr="these_brieuc_last_recueil_files/figure-docx/fig-gs-positive-score-1.png" id="126" name="Picture"/>
+                          <pic:cNvPr descr="these_brieuc_last_recueil_files/figure-docx/fig-gs-positive-score-1.png" id="128" name="Picture"/>
                           <pic:cNvPicPr>
                             <a:picLocks noChangeArrowheads="1" noChangeAspect="1"/>
                           </pic:cNvPicPr>
                         </pic:nvPicPr>
                         <pic:blipFill>
-                          <a:blip r:embed="rId124"/>
+                          <a:blip r:embed="rId126"/>
                           <a:stretch>
                             <a:fillRect/>
                           </a:stretch>
@@ -16324,12 +16414,12 @@
               <w:t xml:space="preserve">Figure 3: Score ULNT par niveau chez les patients confirmés</w:t>
             </w:r>
           </w:p>
-          <w:bookmarkEnd w:id="127"/>
+          <w:bookmarkEnd w:id="129"/>
         </w:tc>
       </w:tr>
     </w:tbl>
-    <w:bookmarkEnd w:id="128"/>
-    <w:bookmarkStart w:id="134" w:name="X703fe49374d10f2f062ed2a4e9ff6878570202b"/>
+    <w:bookmarkEnd w:id="130"/>
+    <w:bookmarkStart w:id="136" w:name="X703fe49374d10f2f062ed2a4e9ff6878570202b"/>
     <w:p>
       <w:pPr>
         <w:pStyle w:val="Heading3"/>
@@ -16359,30 +16449,30 @@
       <w:tr>
         <w:tc>
           <w:tcPr/>
-          <w:bookmarkStart w:id="133" w:name="fig-level-performance-individual"/>
-          <w:p>
-            <w:pPr>
-              <w:pStyle w:val="Compact"/>
-              <w:jc w:val="center"/>
-            </w:pPr>
-            <w:bookmarkStart w:id="132" w:name="fig-level-performance-individual"/>
+          <w:bookmarkStart w:id="135" w:name="fig-level-performance-individual"/>
+          <w:p>
+            <w:pPr>
+              <w:pStyle w:val="Compact"/>
+              <w:jc w:val="center"/>
+            </w:pPr>
+            <w:bookmarkStart w:id="134" w:name="fig-level-performance-individual"/>
             <w:r>
               <w:drawing>
                 <wp:inline>
                   <wp:extent cx="5334000" cy="7467600"/>
                   <wp:effectExtent b="0" l="0" r="0" t="0"/>
-                  <wp:docPr descr="" title="" id="130" name="Picture"/>
+                  <wp:docPr descr="" title="" id="132" name="Picture"/>
                   <a:graphic>
                     <a:graphicData uri="http://schemas.openxmlformats.org/drawingml/2006/picture">
                       <pic:pic>
                         <pic:nvPicPr>
-                          <pic:cNvPr descr="these_brieuc_last_recueil_files/figure-docx/fig-level-performance-individual-1.png" id="131" name="Picture"/>
+                          <pic:cNvPr descr="these_brieuc_last_recueil_files/figure-docx/fig-level-performance-individual-1.png" id="133" name="Picture"/>
                           <pic:cNvPicPr>
                             <a:picLocks noChangeArrowheads="1" noChangeAspect="1"/>
                           </pic:cNvPicPr>
                         </pic:nvPicPr>
                         <pic:blipFill>
-                          <a:blip r:embed="rId129"/>
+                          <a:blip r:embed="rId131"/>
                           <a:stretch>
                             <a:fillRect/>
                           </a:stretch>
@@ -16408,7 +16498,7 @@
                 </wp:inline>
               </w:drawing>
             </w:r>
-            <w:bookmarkEnd w:id="132"/>
+            <w:bookmarkEnd w:id="134"/>
           </w:p>
           <w:p>
             <w:pPr>
@@ -16423,7 +16513,7 @@
               <w:t xml:space="preserve">Figure 4</w:t>
             </w:r>
           </w:p>
-          <w:bookmarkEnd w:id="133"/>
+          <w:bookmarkEnd w:id="135"/>
         </w:tc>
       </w:tr>
     </w:tbl>
@@ -16432,8 +16522,8 @@
         <w:br w:type="page"/>
       </w:r>
     </w:p>
-    <w:bookmarkEnd w:id="134"/>
-    <w:bookmarkStart w:id="135" w:name="X764f10c84694496ac6af7847083466b3b77ca36"/>
+    <w:bookmarkEnd w:id="136"/>
+    <w:bookmarkStart w:id="137" w:name="X764f10c84694496ac6af7847083466b3b77ca36"/>
     <w:p>
       <w:pPr>
         <w:pStyle w:val="Heading3"/>
@@ -18873,8 +18963,8 @@
         <w:br w:type="page"/>
       </w:r>
     </w:p>
-    <w:bookmarkEnd w:id="135"/>
-    <w:bookmarkStart w:id="139" w:name="Xf6491717f535a2e18f273658a84a918bff84356"/>
+    <w:bookmarkEnd w:id="137"/>
+    <w:bookmarkStart w:id="141" w:name="Xf6491717f535a2e18f273658a84a918bff84356"/>
     <w:p>
       <w:pPr>
         <w:pStyle w:val="Heading3"/>
@@ -18892,18 +18982,18 @@
           <wp:inline>
             <wp:extent cx="5334000" cy="4267200"/>
             <wp:effectExtent b="0" l="0" r="0" t="0"/>
-            <wp:docPr descr="Sensibilité et spécificité par niveau métamérique pour chaque test" title="" id="137" name="Picture"/>
+            <wp:docPr descr="Sensibilité et spécificité par niveau métamérique pour chaque test" title="" id="139" name="Picture"/>
             <a:graphic>
               <a:graphicData uri="http://schemas.openxmlformats.org/drawingml/2006/picture">
                 <pic:pic>
                   <pic:nvPicPr>
-                    <pic:cNvPr descr="these_brieuc_last_recueil_files/figure-docx/results-by-level-test-metric-plot-1.png" id="138" name="Picture"/>
+                    <pic:cNvPr descr="these_brieuc_last_recueil_files/figure-docx/results-by-level-test-metric-plot-1.png" id="140" name="Picture"/>
                     <pic:cNvPicPr>
                       <a:picLocks noChangeArrowheads="1" noChangeAspect="1"/>
                     </pic:cNvPicPr>
                   </pic:nvPicPr>
                   <pic:blipFill>
-                    <a:blip r:embed="rId136"/>
+                    <a:blip r:embed="rId138"/>
                     <a:stretch>
                       <a:fillRect/>
                     </a:stretch>
@@ -21525,9 +21615,9 @@
         <w:br w:type="page"/>
       </w:r>
     </w:p>
-    <w:bookmarkEnd w:id="139"/>
-    <w:bookmarkEnd w:id="140"/>
-    <w:bookmarkStart w:id="144" w:name="analyses-par-niveau-métamérique-regroupé"/>
+    <w:bookmarkEnd w:id="141"/>
+    <w:bookmarkEnd w:id="142"/>
+    <w:bookmarkStart w:id="146" w:name="analyses-par-niveau-métamérique-regroupé"/>
     <w:p>
       <w:pPr>
         <w:pStyle w:val="Heading2"/>
@@ -21831,18 +21921,18 @@
           <wp:inline>
             <wp:extent cx="5334000" cy="4267200"/>
             <wp:effectExtent b="0" l="0" r="0" t="0"/>
-            <wp:docPr descr="Sensibilité et Spécificité (ULNT1) selon l’étage métamérique" title="" id="142" name="Picture"/>
+            <wp:docPr descr="Sensibilité et Spécificité (ULNT1) selon l’étage métamérique" title="" id="144" name="Picture"/>
             <a:graphic>
               <a:graphicData uri="http://schemas.openxmlformats.org/drawingml/2006/picture">
                 <pic:pic>
                   <pic:nvPicPr>
-                    <pic:cNvPr descr="these_brieuc_last_recueil_files/figure-docx/level-grouped-plot-1.png" id="143" name="Picture"/>
+                    <pic:cNvPr descr="these_brieuc_last_recueil_files/figure-docx/level-grouped-plot-1.png" id="145" name="Picture"/>
                     <pic:cNvPicPr>
                       <a:picLocks noChangeArrowheads="1" noChangeAspect="1"/>
                     </pic:cNvPicPr>
                   </pic:nvPicPr>
                   <pic:blipFill>
-                    <a:blip r:embed="rId141"/>
+                    <a:blip r:embed="rId143"/>
                     <a:stretch>
                       <a:fillRect/>
                     </a:stretch>
@@ -21890,8 +21980,8 @@
         <w:br w:type="page"/>
       </w:r>
     </w:p>
-    <w:bookmarkEnd w:id="144"/>
-    <w:bookmarkStart w:id="147" w:name="X5f2088ebd1452b5ba2e72bca91cf173f1488185"/>
+    <w:bookmarkEnd w:id="146"/>
+    <w:bookmarkStart w:id="149" w:name="X5f2088ebd1452b5ba2e72bca91cf173f1488185"/>
     <w:p>
       <w:pPr>
         <w:pStyle w:val="Heading2"/>
@@ -22152,7 +22242,7 @@
         </w:tc>
       </w:tr>
     </w:tbl>
-    <w:bookmarkStart w:id="145" w:name="interprétation-4"/>
+    <w:bookmarkStart w:id="147" w:name="interprétation-4"/>
     <w:p>
       <w:pPr>
         <w:pStyle w:val="Heading3"/>
@@ -22253,8 +22343,8 @@
         <w:t xml:space="preserve">Cette étude doit être considérée comme une étape exploratoire robuste. Elle démontre une hiérarchie claire entre les tests, mais confirme qu’une étude de confirmation visant une précision étroite nécessiterait une cohorte plus large, d’environ 93 patients avec la prévalence observée, pour compenser une spécificité plus faible qu’attendu.</w:t>
       </w:r>
     </w:p>
-    <w:bookmarkEnd w:id="145"/>
-    <w:bookmarkStart w:id="146" w:name="X327af1bda9aaac52b4ba9f934de637f25ad4f79"/>
+    <w:bookmarkEnd w:id="147"/>
+    <w:bookmarkStart w:id="148" w:name="X327af1bda9aaac52b4ba9f934de637f25ad4f79"/>
     <w:p>
       <w:pPr>
         <w:pStyle w:val="Heading3"/>
@@ -22276,9 +22366,9 @@
         <w:br w:type="page"/>
       </w:r>
     </w:p>
-    <w:bookmarkEnd w:id="146"/>
-    <w:bookmarkEnd w:id="147"/>
-    <w:bookmarkStart w:id="167" w:name="Xa74f6e5e5a07d3b1e6f81174b7b050bbc6693ee"/>
+    <w:bookmarkEnd w:id="148"/>
+    <w:bookmarkEnd w:id="149"/>
+    <w:bookmarkStart w:id="169" w:name="Xa74f6e5e5a07d3b1e6f81174b7b050bbc6693ee"/>
     <w:p>
       <w:pPr>
         <w:pStyle w:val="Heading2"/>
@@ -22394,7 +22484,7 @@
         <w:t xml:space="preserve">final positif. Cette approche est volontairement stricte et doit être interprétée comme une analyse exploratoire.</w:t>
       </w:r>
     </w:p>
-    <w:bookmarkStart w:id="155" w:name="Xa192f37cf83a10b999fde97a2d384c51e445d4f"/>
+    <w:bookmarkStart w:id="157" w:name="Xa192f37cf83a10b999fde97a2d384c51e445d4f"/>
     <w:p>
       <w:pPr>
         <w:pStyle w:val="Heading3"/>
@@ -22463,7 +22553,7 @@
         <w:t xml:space="preserve">(26 cas positifs avec confirmation par infiltration et 26 cas négatifs du gold standard final).</w:t>
       </w:r>
     </w:p>
-    <w:bookmarkStart w:id="154" w:name="Xd66c688fc52a650573970ca45f422c6ebf5cd42"/>
+    <w:bookmarkStart w:id="156" w:name="Xd66c688fc52a650573970ca45f422c6ebf5cd42"/>
     <w:p>
       <w:pPr>
         <w:pStyle w:val="Heading4"/>
@@ -22518,7 +22608,7 @@
       <w:tr>
         <w:tc>
           <w:tcPr/>
-          <w:bookmarkStart w:id="148" w:name="tbl-strong-a1-indiv"/>
+          <w:bookmarkStart w:id="150" w:name="tbl-strong-a1-indiv"/>
           <w:p>
             <w:pPr>
               <w:jc w:val="center"/>
@@ -23017,7 +23107,7 @@
               </w:tc>
             </w:tr>
           </w:tbl>
-          <w:bookmarkEnd w:id="148"/>
+          <w:bookmarkEnd w:id="150"/>
           <w:p/>
         </w:tc>
       </w:tr>
@@ -23043,7 +23133,7 @@
       <w:tr>
         <w:tc>
           <w:tcPr/>
-          <w:bookmarkStart w:id="149" w:name="tbl-comp-a1-sensi"/>
+          <w:bookmarkStart w:id="151" w:name="tbl-comp-a1-sensi"/>
           <w:p>
             <w:pPr>
               <w:jc w:val="center"/>
@@ -23277,7 +23367,7 @@
               </w:tc>
             </w:tr>
           </w:tbl>
-          <w:bookmarkEnd w:id="149"/>
+          <w:bookmarkEnd w:id="151"/>
           <w:p/>
         </w:tc>
       </w:tr>
@@ -23303,7 +23393,7 @@
       <w:tr>
         <w:tc>
           <w:tcPr/>
-          <w:bookmarkStart w:id="150" w:name="tbl-strong-a1-comb"/>
+          <w:bookmarkStart w:id="152" w:name="tbl-strong-a1-comb"/>
           <w:p>
             <w:pPr>
               <w:jc w:val="center"/>
@@ -24453,7 +24543,7 @@
               </w:tc>
             </w:tr>
           </w:tbl>
-          <w:bookmarkEnd w:id="150"/>
+          <w:bookmarkEnd w:id="152"/>
           <w:p/>
         </w:tc>
       </w:tr>
@@ -24479,7 +24569,7 @@
       <w:tr>
         <w:tc>
           <w:tcPr/>
-          <w:bookmarkStart w:id="151" w:name="tbl-comp-a1-comb"/>
+          <w:bookmarkStart w:id="153" w:name="tbl-comp-a1-comb"/>
           <w:p>
             <w:pPr>
               <w:jc w:val="center"/>
@@ -25000,7 +25090,7 @@
               </w:tc>
             </w:tr>
           </w:tbl>
-          <w:bookmarkEnd w:id="151"/>
+          <w:bookmarkEnd w:id="153"/>
           <w:p/>
         </w:tc>
       </w:tr>
@@ -25026,7 +25116,7 @@
       <w:tr>
         <w:tc>
           <w:tcPr/>
-          <w:bookmarkStart w:id="152" w:name="tbl-strong-a1-score"/>
+          <w:bookmarkStart w:id="154" w:name="tbl-strong-a1-score"/>
           <w:p>
             <w:pPr>
               <w:jc w:val="center"/>
@@ -25525,7 +25615,7 @@
               </w:tc>
             </w:tr>
           </w:tbl>
-          <w:bookmarkEnd w:id="152"/>
+          <w:bookmarkEnd w:id="154"/>
           <w:p/>
         </w:tc>
       </w:tr>
@@ -25551,7 +25641,7 @@
       <w:tr>
         <w:tc>
           <w:tcPr/>
-          <w:bookmarkStart w:id="153" w:name="tbl-comp-a1-score"/>
+          <w:bookmarkStart w:id="155" w:name="tbl-comp-a1-score"/>
           <w:p>
             <w:pPr>
               <w:jc w:val="center"/>
@@ -25785,7 +25875,7 @@
               </w:tc>
             </w:tr>
           </w:tbl>
-          <w:bookmarkEnd w:id="153"/>
+          <w:bookmarkEnd w:id="155"/>
           <w:p/>
         </w:tc>
       </w:tr>
@@ -25795,9 +25885,9 @@
         <w:br w:type="page"/>
       </w:r>
     </w:p>
-    <w:bookmarkEnd w:id="154"/>
-    <w:bookmarkEnd w:id="155"/>
-    <w:bookmarkStart w:id="166" w:name="Xfc1f0e7fb5d30fbf15f6f63ce4005f3bfc8dd76"/>
+    <w:bookmarkEnd w:id="156"/>
+    <w:bookmarkEnd w:id="157"/>
+    <w:bookmarkStart w:id="168" w:name="Xfc1f0e7fb5d30fbf15f6f63ce4005f3bfc8dd76"/>
     <w:p>
       <w:pPr>
         <w:pStyle w:val="Heading3"/>
@@ -25868,7 +25958,7 @@
         <w:t xml:space="preserve">), avec 26 cas positifs confirmés par infiltration et 45 cas classés négatifs dans cette définition secondaire.</w:t>
       </w:r>
     </w:p>
-    <w:bookmarkStart w:id="165" w:name="X8dc8954848c8982c78d0f98ab6d387465f3dc1d"/>
+    <w:bookmarkStart w:id="167" w:name="X8dc8954848c8982c78d0f98ab6d387465f3dc1d"/>
     <w:p>
       <w:pPr>
         <w:pStyle w:val="Heading4"/>
@@ -25995,7 +26085,7 @@
       <w:tr>
         <w:tc>
           <w:tcPr/>
-          <w:bookmarkStart w:id="156" w:name="tbl-strong-a2-indiv"/>
+          <w:bookmarkStart w:id="158" w:name="tbl-strong-a2-indiv"/>
           <w:p>
             <w:pPr>
               <w:jc w:val="center"/>
@@ -26494,7 +26584,7 @@
               </w:tc>
             </w:tr>
           </w:tbl>
-          <w:bookmarkEnd w:id="156"/>
+          <w:bookmarkEnd w:id="158"/>
           <w:p/>
         </w:tc>
       </w:tr>
@@ -26520,7 +26610,7 @@
       <w:tr>
         <w:tc>
           <w:tcPr/>
-          <w:bookmarkStart w:id="157" w:name="tbl-comp-a2-spe"/>
+          <w:bookmarkStart w:id="159" w:name="tbl-comp-a2-spe"/>
           <w:p>
             <w:pPr>
               <w:jc w:val="center"/>
@@ -26754,7 +26844,7 @@
               </w:tc>
             </w:tr>
           </w:tbl>
-          <w:bookmarkEnd w:id="157"/>
+          <w:bookmarkEnd w:id="159"/>
           <w:p/>
         </w:tc>
       </w:tr>
@@ -26780,7 +26870,7 @@
       <w:tr>
         <w:tc>
           <w:tcPr/>
-          <w:bookmarkStart w:id="158" w:name="tbl-strong-a2-comb"/>
+          <w:bookmarkStart w:id="160" w:name="tbl-strong-a2-comb"/>
           <w:p>
             <w:pPr>
               <w:jc w:val="center"/>
@@ -27930,7 +28020,7 @@
               </w:tc>
             </w:tr>
           </w:tbl>
-          <w:bookmarkEnd w:id="158"/>
+          <w:bookmarkEnd w:id="160"/>
           <w:p/>
         </w:tc>
       </w:tr>
@@ -27956,7 +28046,7 @@
       <w:tr>
         <w:tc>
           <w:tcPr/>
-          <w:bookmarkStart w:id="159" w:name="tbl-comp-a2-comb"/>
+          <w:bookmarkStart w:id="161" w:name="tbl-comp-a2-comb"/>
           <w:p>
             <w:pPr>
               <w:jc w:val="center"/>
@@ -28792,7 +28882,7 @@
               </w:tc>
             </w:tr>
           </w:tbl>
-          <w:bookmarkEnd w:id="159"/>
+          <w:bookmarkEnd w:id="161"/>
           <w:p/>
         </w:tc>
       </w:tr>
@@ -28818,7 +28908,7 @@
       <w:tr>
         <w:tc>
           <w:tcPr/>
-          <w:bookmarkStart w:id="160" w:name="tbl-strong-a2-score"/>
+          <w:bookmarkStart w:id="162" w:name="tbl-strong-a2-score"/>
           <w:p>
             <w:pPr>
               <w:jc w:val="center"/>
@@ -29317,7 +29407,7 @@
               </w:tc>
             </w:tr>
           </w:tbl>
-          <w:bookmarkEnd w:id="160"/>
+          <w:bookmarkEnd w:id="162"/>
           <w:p/>
         </w:tc>
       </w:tr>
@@ -29343,7 +29433,7 @@
       <w:tr>
         <w:tc>
           <w:tcPr/>
-          <w:bookmarkStart w:id="161" w:name="tbl-comp-a2-score"/>
+          <w:bookmarkStart w:id="163" w:name="tbl-comp-a2-score"/>
           <w:p>
             <w:pPr>
               <w:jc w:val="center"/>
@@ -29710,13 +29800,13 @@
               </w:tc>
             </w:tr>
           </w:tbl>
-          <w:bookmarkEnd w:id="161"/>
+          <w:bookmarkEnd w:id="163"/>
           <w:p/>
         </w:tc>
       </w:tr>
     </w:tbl>
-    <w:bookmarkStart w:id="164" w:name="refs"/>
-    <w:bookmarkStart w:id="163" w:name="X130cc6218cdcb99520dccce7f8b213552eaa63a"/>
+    <w:bookmarkStart w:id="166" w:name="refs"/>
+    <w:bookmarkStart w:id="165" w:name="X130cc6218cdcb99520dccce7f8b213552eaa63a"/>
     <w:p>
       <w:pPr>
         <w:pStyle w:val="Bibliography"/>
@@ -29730,7 +29820,7 @@
       <w:r>
         <w:t xml:space="preserve">“</w:t>
       </w:r>
-      <w:hyperlink r:id="rId162">
+      <w:hyperlink r:id="rId164">
         <w:r>
           <w:rPr>
             <w:rStyle w:val="Hyperlink"/>
@@ -29758,12 +29848,12 @@
         <w:t xml:space="preserve">33 (1): 159–74.</w:t>
       </w:r>
     </w:p>
-    <w:bookmarkEnd w:id="163"/>
-    <w:bookmarkEnd w:id="164"/>
     <w:bookmarkEnd w:id="165"/>
     <w:bookmarkEnd w:id="166"/>
     <w:bookmarkEnd w:id="167"/>
     <w:bookmarkEnd w:id="168"/>
+    <w:bookmarkEnd w:id="169"/>
+    <w:bookmarkEnd w:id="170"/>
     <w:sectPr>
       <w:footnotePr>
         <w:numRestart w:val="eachSect"/>

</xml_diff>

<commit_message>
Finalize public repository cleanup
</commit_message>
<xml_diff>
--- a/docs/these_brieuc_last_recueil.docx
+++ b/docs/these_brieuc_last_recueil.docx
@@ -2128,7 +2128,7 @@
       </w:r>
     </w:p>
     <w:bookmarkEnd w:id="29"/>
-    <w:bookmarkStart w:id="168" w:name="résultats"/>
+    <w:bookmarkStart w:id="170" w:name="résultats"/>
     <w:p>
       <w:pPr>
         <w:pStyle w:val="Heading1"/>
@@ -11417,7 +11417,7 @@
       </w:r>
     </w:p>
     <w:bookmarkEnd w:id="95"/>
-    <w:bookmarkStart w:id="112" w:name="combinaisons-et-score-de-positivité-ulnt"/>
+    <w:bookmarkStart w:id="114" w:name="combinaisons-et-score-de-positivité-ulnt"/>
     <w:p>
       <w:pPr>
         <w:pStyle w:val="Heading2"/>
@@ -13627,7 +13627,7 @@
       </w:r>
     </w:p>
     <w:bookmarkEnd w:id="96"/>
-    <w:bookmarkStart w:id="111" w:name="X03dbcbbf9db0121bf925d0d666616bf3a5f62d7"/>
+    <w:bookmarkStart w:id="113" w:name="X03dbcbbf9db0121bf925d0d666616bf3a5f62d7"/>
     <w:p>
       <w:pPr>
         <w:pStyle w:val="Heading3"/>
@@ -14817,7 +14817,7 @@
       </w:r>
     </w:p>
     <w:bookmarkEnd w:id="100"/>
-    <w:bookmarkStart w:id="110" w:name="gain-de-spécificité"/>
+    <w:bookmarkStart w:id="112" w:name="gain-de-spécificité"/>
     <w:p>
       <w:pPr>
         <w:pStyle w:val="Heading4"/>
@@ -15391,63 +15391,153 @@
         <w:t xml:space="preserve">Courbe ROC du score global (Nombre de tests positifs)</w:t>
       </w:r>
     </w:p>
-    <w:p>
-      <w:pPr>
-        <w:pStyle w:val="BodyText"/>
-      </w:pPr>
-      <w:r>
-        <w:t xml:space="preserve">::: {. callout-important title=</w:t>
-      </w:r>
-      <w:r>
-        <w:t xml:space="preserve">“ATTENTION BRIEUC”</w:t>
-      </w:r>
-      <w:r>
-        <w:t xml:space="preserve">}</w:t>
-      </w:r>
-      <w:r>
-        <w:t xml:space="preserve"> </w:t>
-      </w:r>
-      <w:r>
-        <w:t xml:space="preserve">- Les courbes ROC c’est vraiment pas terrible pour un score discret (c’est à dire uniquement des nombres entiers)</w:t>
-      </w:r>
-    </w:p>
-    <w:p>
-      <w:pPr>
-        <w:numPr>
-          <w:ilvl w:val="0"/>
-          <w:numId w:val="1031"/>
-        </w:numPr>
-      </w:pPr>
-      <w:r>
-        <w:t xml:space="preserve">Donc pas très joli : je le mettrais pas</w:t>
-      </w:r>
-    </w:p>
-    <w:p>
-      <w:pPr>
-        <w:numPr>
-          <w:ilvl w:val="0"/>
-          <w:numId w:val="1031"/>
-        </w:numPr>
-      </w:pPr>
-      <w:r>
-        <w:t xml:space="preserve">ÇA VA C’EST ÉCRIT ASSEZ GROS ??</w:t>
-      </w:r>
-      <w:r>
-        <w:t xml:space="preserve"> </w:t>
-      </w:r>
-      <w:r>
-        <w:t xml:space="preserve">:::</w:t>
-      </w:r>
-    </w:p>
+    <w:tbl>
+      <w:tblPr>
+        <w:tblStyle w:val="Table"/>
+        <w:tblLook w:firstRow="0" w:lastRow="0" w:firstColumn="0" w:lastColumn="0" w:noHBand="0" w:noVBand="0" w:val="0000"/>
+        <w:tblBorders>
+          <w:top w:val="single" w:sz="4" w:space="0" w:color="CC1914"/>
+          <w:left w:val="single" w:sz="24" w:space="0" w:color="CC1914"/>
+          <w:bottom w:val="single" w:sz="4" w:space="0" w:color="CC1914"/>
+          <w:right w:val="single" w:sz="4" w:space="0" w:color="CC1914"/>
+        </w:tblBorders>
+        <w:tblCellMar>
+          <w:left w:w="144" w:type="dxa"/>
+          <w:right w:w="144" w:type="dxa"/>
+        </w:tblCellMar>
+        <w:tblLook w:firstRow="0" w:lastRow="0" w:firstColumn="0" w:lastColumn="0" w:noHBand="0" w:noVBand="0" w:val="0000"/>
+      </w:tblPr>
+      <w:tr>
+        <w:trPr>
+          <w:cantSplit/>
+        </w:trPr>
+        <w:tc>
+          <w:tcPr>
+            <w:shd w:color="auto" w:fill="f7dddc" w:val="clear"/>
+            <w:tcMar>
+              <w:top w:w="92" w:type="dxa"/>
+              <w:bottom w:w="92" w:type="dxa"/>
+            </w:tcMar>
+          </w:tcPr>
+          <w:p>
+            <w:pPr>
+              <w:pStyle w:val="BodyText"/>
+            </w:pPr>
+            <w:pPr>
+              <w:spacing w:before="0" w:after="0"/>
+              <w:textAlignment w:val="center"/>
+            </w:pPr>
+            <w:r>
+              <w:drawing>
+                <wp:inline>
+                  <wp:extent cx="152400" cy="152400"/>
+                  <wp:effectExtent b="0" l="0" r="0" t="0"/>
+                  <wp:docPr descr="" title="" id="110" name="Picture"/>
+                  <a:graphic>
+                    <a:graphicData uri="http://schemas.openxmlformats.org/drawingml/2006/picture">
+                      <pic:pic>
+                        <pic:nvPicPr>
+                          <pic:cNvPr descr="/Applications/quarto/share/formats/docx/important.png" id="111" name="Picture"/>
+                          <pic:cNvPicPr>
+                            <a:picLocks noChangeArrowheads="1" noChangeAspect="1"/>
+                          </pic:cNvPicPr>
+                        </pic:nvPicPr>
+                        <pic:blipFill>
+                          <a:blip r:embed="rId65"/>
+                          <a:stretch>
+                            <a:fillRect/>
+                          </a:stretch>
+                        </pic:blipFill>
+                        <pic:spPr bwMode="auto">
+                          <a:xfrm>
+                            <a:off x="0" y="0"/>
+                            <a:ext cx="152400" cy="152400"/>
+                          </a:xfrm>
+                          <a:prstGeom prst="rect">
+                            <a:avLst/>
+                          </a:prstGeom>
+                          <a:noFill/>
+                          <a:ln w="9525">
+                            <a:noFill/>
+                            <a:headEnd/>
+                            <a:tailEnd/>
+                          </a:ln>
+                        </pic:spPr>
+                      </pic:pic>
+                    </a:graphicData>
+                  </a:graphic>
+                </wp:inline>
+              </w:drawing>
+            </w:r>
+            <w:r>
+              <w:t xml:space="preserve"> </w:t>
+            </w:r>
+            <w:r>
+              <w:t xml:space="preserve"> </w:t>
+            </w:r>
+            <w:r>
+              <w:t xml:space="preserve">ATTENTION BRIEUC</w:t>
+            </w:r>
+          </w:p>
+        </w:tc>
+      </w:tr>
+      <w:tr>
+        <w:trPr>
+          <w:cantSplit/>
+        </w:trPr>
+        <w:tc>
+          <w:tcPr>
+            <w:tcMar>
+              <w:top w:w="108" w:type="dxa"/>
+              <w:bottom w:w="108" w:type="dxa"/>
+            </w:tcMar>
+          </w:tcPr>
+          <w:p>
+            <w:pPr>
+              <w:numPr>
+                <w:ilvl w:val="0"/>
+                <w:numId w:val="1031"/>
+              </w:numPr>
+            </w:pPr>
+            <w:r>
+              <w:t xml:space="preserve">Les courbes ROC c’est vraiment pas terrible pour un score discret (c’est à dire uniquement des nombres entiers)</w:t>
+            </w:r>
+          </w:p>
+          <w:p>
+            <w:pPr>
+              <w:numPr>
+                <w:ilvl w:val="0"/>
+                <w:numId w:val="1031"/>
+              </w:numPr>
+            </w:pPr>
+            <w:r>
+              <w:t xml:space="preserve">Donc pas très joli : je le mettrais pas</w:t>
+            </w:r>
+          </w:p>
+          <w:p>
+            <w:pPr>
+              <w:numPr>
+                <w:ilvl w:val="0"/>
+                <w:numId w:val="1031"/>
+              </w:numPr>
+            </w:pPr>
+            <w:r>
+              <w:t xml:space="preserve">ÇA VA C’EST ÉCRIT ASSEZ GROS ??</w:t>
+            </w:r>
+          </w:p>
+          <w:p/>
+        </w:tc>
+      </w:tr>
+    </w:tbl>
     <w:p>
       <w:r>
         <w:br w:type="page"/>
       </w:r>
     </w:p>
-    <w:bookmarkEnd w:id="110"/>
-    <w:bookmarkEnd w:id="111"/>
     <w:bookmarkEnd w:id="112"/>
-    <w:bookmarkStart w:id="140" w:name="Xd9c2445cfe2dcec6a85ff49d15ae9240c0cf3af"/>
+    <w:bookmarkEnd w:id="113"/>
+    <w:bookmarkEnd w:id="114"/>
+    <w:bookmarkStart w:id="142" w:name="Xd9c2445cfe2dcec6a85ff49d15ae9240c0cf3af"/>
     <w:p>
       <w:pPr>
         <w:pStyle w:val="Heading2"/>
@@ -15464,7 +15554,7 @@
         <w:t xml:space="preserve">Résultats par niveau métamérique, exploratoires du fait des effectifs très faibles à certains niveaux.</w:t>
       </w:r>
     </w:p>
-    <w:bookmarkStart w:id="119" w:name="résumé-descriptif-par-niveau-métamérique"/>
+    <w:bookmarkStart w:id="121" w:name="résumé-descriptif-par-niveau-métamérique"/>
     <w:p>
       <w:pPr>
         <w:pStyle w:val="Heading3"/>
@@ -15954,18 +16044,18 @@
           <wp:inline>
             <wp:extent cx="5334000" cy="4267200"/>
             <wp:effectExtent b="0" l="0" r="0" t="0"/>
-            <wp:docPr descr="Effectif de NCB par niveau métamérique" title="" id="114" name="Picture"/>
+            <wp:docPr descr="Effectif de NCB par niveau métamérique" title="" id="116" name="Picture"/>
             <a:graphic>
               <a:graphicData uri="http://schemas.openxmlformats.org/drawingml/2006/picture">
                 <pic:pic>
                   <pic:nvPicPr>
-                    <pic:cNvPr descr="these_brieuc_last_recueil_files/figure-docx/results-by-level-rate-1.png" id="115" name="Picture"/>
+                    <pic:cNvPr descr="these_brieuc_last_recueil_files/figure-docx/results-by-level-rate-1.png" id="117" name="Picture"/>
                     <pic:cNvPicPr>
                       <a:picLocks noChangeArrowheads="1" noChangeAspect="1"/>
                     </pic:cNvPicPr>
                   </pic:nvPicPr>
                   <pic:blipFill>
-                    <a:blip r:embed="rId113"/>
+                    <a:blip r:embed="rId115"/>
                     <a:stretch>
                       <a:fillRect/>
                     </a:stretch>
@@ -16009,18 +16099,18 @@
           <wp:inline>
             <wp:extent cx="5334000" cy="4267200"/>
             <wp:effectExtent b="0" l="0" r="0" t="0"/>
-            <wp:docPr descr="Distribution du score ULNT selon le niveau métamérique" title="" id="117" name="Picture"/>
+            <wp:docPr descr="Distribution du score ULNT selon le niveau métamérique" title="" id="119" name="Picture"/>
             <a:graphic>
               <a:graphicData uri="http://schemas.openxmlformats.org/drawingml/2006/picture">
                 <pic:pic>
                   <pic:nvPicPr>
-                    <pic:cNvPr descr="these_brieuc_last_recueil_files/figure-docx/results-by-level-count-1.png" id="118" name="Picture"/>
+                    <pic:cNvPr descr="these_brieuc_last_recueil_files/figure-docx/results-by-level-count-1.png" id="120" name="Picture"/>
                     <pic:cNvPicPr>
                       <a:picLocks noChangeArrowheads="1" noChangeAspect="1"/>
                     </pic:cNvPicPr>
                   </pic:nvPicPr>
                   <pic:blipFill>
-                    <a:blip r:embed="rId116"/>
+                    <a:blip r:embed="rId118"/>
                     <a:stretch>
                       <a:fillRect/>
                     </a:stretch>
@@ -16152,8 +16242,8 @@
         <w:br w:type="page"/>
       </w:r>
     </w:p>
-    <w:bookmarkEnd w:id="119"/>
-    <w:bookmarkStart w:id="128" w:name="X24df2f30bf32bdef8b2f19a40875147e62cc664"/>
+    <w:bookmarkEnd w:id="121"/>
+    <w:bookmarkStart w:id="130" w:name="X24df2f30bf32bdef8b2f19a40875147e62cc664"/>
     <w:p>
       <w:pPr>
         <w:pStyle w:val="Heading3"/>
@@ -16183,7 +16273,7 @@
       <w:tr>
         <w:tc>
           <w:tcPr/>
-          <w:bookmarkStart w:id="123" w:name="fig-gs-positive-level"/>
+          <w:bookmarkStart w:id="125" w:name="fig-gs-positive-level"/>
           <w:p>
             <w:pPr>
               <w:pStyle w:val="Compact"/>
@@ -16194,18 +16284,18 @@
                 <wp:inline>
                   <wp:extent cx="5334000" cy="4267200"/>
                   <wp:effectExtent b="0" l="0" r="0" t="0"/>
-                  <wp:docPr descr="" title="" id="121" name="Picture"/>
+                  <wp:docPr descr="" title="" id="123" name="Picture"/>
                   <a:graphic>
                     <a:graphicData uri="http://schemas.openxmlformats.org/drawingml/2006/picture">
                       <pic:pic>
                         <pic:nvPicPr>
-                          <pic:cNvPr descr="these_brieuc_last_recueil_files/figure-docx/fig-gs-positive-level-1.png" id="122" name="Picture"/>
+                          <pic:cNvPr descr="these_brieuc_last_recueil_files/figure-docx/fig-gs-positive-level-1.png" id="124" name="Picture"/>
                           <pic:cNvPicPr>
                             <a:picLocks noChangeArrowheads="1" noChangeAspect="1"/>
                           </pic:cNvPicPr>
                         </pic:nvPicPr>
                         <pic:blipFill>
-                          <a:blip r:embed="rId120"/>
+                          <a:blip r:embed="rId122"/>
                           <a:stretch>
                             <a:fillRect/>
                           </a:stretch>
@@ -16245,7 +16335,7 @@
               <w:t xml:space="preserve">Figure 2: Répartition des niveaux métamériques uniquement chez les cas confirmés</w:t>
             </w:r>
           </w:p>
-          <w:bookmarkEnd w:id="123"/>
+          <w:bookmarkEnd w:id="125"/>
         </w:tc>
       </w:tr>
     </w:tbl>
@@ -16262,7 +16352,7 @@
       <w:tr>
         <w:tc>
           <w:tcPr/>
-          <w:bookmarkStart w:id="127" w:name="fig-gs-positive-score"/>
+          <w:bookmarkStart w:id="129" w:name="fig-gs-positive-score"/>
           <w:p>
             <w:pPr>
               <w:pStyle w:val="Compact"/>
@@ -16273,18 +16363,18 @@
                 <wp:inline>
                   <wp:extent cx="5334000" cy="4267200"/>
                   <wp:effectExtent b="0" l="0" r="0" t="0"/>
-                  <wp:docPr descr="" title="" id="125" name="Picture"/>
+                  <wp:docPr descr="" title="" id="127" name="Picture"/>
                   <a:graphic>
                     <a:graphicData uri="http://schemas.openxmlformats.org/drawingml/2006/picture">
                       <pic:pic>
                         <pic:nvPicPr>
-                          <pic:cNvPr descr="these_brieuc_last_recueil_files/figure-docx/fig-gs-positive-score-1.png" id="126" name="Picture"/>
+                          <pic:cNvPr descr="these_brieuc_last_recueil_files/figure-docx/fig-gs-positive-score-1.png" id="128" name="Picture"/>
                           <pic:cNvPicPr>
                             <a:picLocks noChangeArrowheads="1" noChangeAspect="1"/>
                           </pic:cNvPicPr>
                         </pic:nvPicPr>
                         <pic:blipFill>
-                          <a:blip r:embed="rId124"/>
+                          <a:blip r:embed="rId126"/>
                           <a:stretch>
                             <a:fillRect/>
                           </a:stretch>
@@ -16324,12 +16414,12 @@
               <w:t xml:space="preserve">Figure 3: Score ULNT par niveau chez les patients confirmés</w:t>
             </w:r>
           </w:p>
-          <w:bookmarkEnd w:id="127"/>
+          <w:bookmarkEnd w:id="129"/>
         </w:tc>
       </w:tr>
     </w:tbl>
-    <w:bookmarkEnd w:id="128"/>
-    <w:bookmarkStart w:id="134" w:name="X703fe49374d10f2f062ed2a4e9ff6878570202b"/>
+    <w:bookmarkEnd w:id="130"/>
+    <w:bookmarkStart w:id="136" w:name="X703fe49374d10f2f062ed2a4e9ff6878570202b"/>
     <w:p>
       <w:pPr>
         <w:pStyle w:val="Heading3"/>
@@ -16359,30 +16449,30 @@
       <w:tr>
         <w:tc>
           <w:tcPr/>
-          <w:bookmarkStart w:id="133" w:name="fig-level-performance-individual"/>
-          <w:p>
-            <w:pPr>
-              <w:pStyle w:val="Compact"/>
-              <w:jc w:val="center"/>
-            </w:pPr>
-            <w:bookmarkStart w:id="132" w:name="fig-level-performance-individual"/>
+          <w:bookmarkStart w:id="135" w:name="fig-level-performance-individual"/>
+          <w:p>
+            <w:pPr>
+              <w:pStyle w:val="Compact"/>
+              <w:jc w:val="center"/>
+            </w:pPr>
+            <w:bookmarkStart w:id="134" w:name="fig-level-performance-individual"/>
             <w:r>
               <w:drawing>
                 <wp:inline>
                   <wp:extent cx="5334000" cy="7467600"/>
                   <wp:effectExtent b="0" l="0" r="0" t="0"/>
-                  <wp:docPr descr="" title="" id="130" name="Picture"/>
+                  <wp:docPr descr="" title="" id="132" name="Picture"/>
                   <a:graphic>
                     <a:graphicData uri="http://schemas.openxmlformats.org/drawingml/2006/picture">
                       <pic:pic>
                         <pic:nvPicPr>
-                          <pic:cNvPr descr="these_brieuc_last_recueil_files/figure-docx/fig-level-performance-individual-1.png" id="131" name="Picture"/>
+                          <pic:cNvPr descr="these_brieuc_last_recueil_files/figure-docx/fig-level-performance-individual-1.png" id="133" name="Picture"/>
                           <pic:cNvPicPr>
                             <a:picLocks noChangeArrowheads="1" noChangeAspect="1"/>
                           </pic:cNvPicPr>
                         </pic:nvPicPr>
                         <pic:blipFill>
-                          <a:blip r:embed="rId129"/>
+                          <a:blip r:embed="rId131"/>
                           <a:stretch>
                             <a:fillRect/>
                           </a:stretch>
@@ -16408,7 +16498,7 @@
                 </wp:inline>
               </w:drawing>
             </w:r>
-            <w:bookmarkEnd w:id="132"/>
+            <w:bookmarkEnd w:id="134"/>
           </w:p>
           <w:p>
             <w:pPr>
@@ -16423,7 +16513,7 @@
               <w:t xml:space="preserve">Figure 4</w:t>
             </w:r>
           </w:p>
-          <w:bookmarkEnd w:id="133"/>
+          <w:bookmarkEnd w:id="135"/>
         </w:tc>
       </w:tr>
     </w:tbl>
@@ -16432,8 +16522,8 @@
         <w:br w:type="page"/>
       </w:r>
     </w:p>
-    <w:bookmarkEnd w:id="134"/>
-    <w:bookmarkStart w:id="135" w:name="X764f10c84694496ac6af7847083466b3b77ca36"/>
+    <w:bookmarkEnd w:id="136"/>
+    <w:bookmarkStart w:id="137" w:name="X764f10c84694496ac6af7847083466b3b77ca36"/>
     <w:p>
       <w:pPr>
         <w:pStyle w:val="Heading3"/>
@@ -18873,8 +18963,8 @@
         <w:br w:type="page"/>
       </w:r>
     </w:p>
-    <w:bookmarkEnd w:id="135"/>
-    <w:bookmarkStart w:id="139" w:name="Xf6491717f535a2e18f273658a84a918bff84356"/>
+    <w:bookmarkEnd w:id="137"/>
+    <w:bookmarkStart w:id="141" w:name="Xf6491717f535a2e18f273658a84a918bff84356"/>
     <w:p>
       <w:pPr>
         <w:pStyle w:val="Heading3"/>
@@ -18892,18 +18982,18 @@
           <wp:inline>
             <wp:extent cx="5334000" cy="4267200"/>
             <wp:effectExtent b="0" l="0" r="0" t="0"/>
-            <wp:docPr descr="Sensibilité et spécificité par niveau métamérique pour chaque test" title="" id="137" name="Picture"/>
+            <wp:docPr descr="Sensibilité et spécificité par niveau métamérique pour chaque test" title="" id="139" name="Picture"/>
             <a:graphic>
               <a:graphicData uri="http://schemas.openxmlformats.org/drawingml/2006/picture">
                 <pic:pic>
                   <pic:nvPicPr>
-                    <pic:cNvPr descr="these_brieuc_last_recueil_files/figure-docx/results-by-level-test-metric-plot-1.png" id="138" name="Picture"/>
+                    <pic:cNvPr descr="these_brieuc_last_recueil_files/figure-docx/results-by-level-test-metric-plot-1.png" id="140" name="Picture"/>
                     <pic:cNvPicPr>
                       <a:picLocks noChangeArrowheads="1" noChangeAspect="1"/>
                     </pic:cNvPicPr>
                   </pic:nvPicPr>
                   <pic:blipFill>
-                    <a:blip r:embed="rId136"/>
+                    <a:blip r:embed="rId138"/>
                     <a:stretch>
                       <a:fillRect/>
                     </a:stretch>
@@ -21525,9 +21615,9 @@
         <w:br w:type="page"/>
       </w:r>
     </w:p>
-    <w:bookmarkEnd w:id="139"/>
-    <w:bookmarkEnd w:id="140"/>
-    <w:bookmarkStart w:id="144" w:name="analyses-par-niveau-métamérique-regroupé"/>
+    <w:bookmarkEnd w:id="141"/>
+    <w:bookmarkEnd w:id="142"/>
+    <w:bookmarkStart w:id="146" w:name="analyses-par-niveau-métamérique-regroupé"/>
     <w:p>
       <w:pPr>
         <w:pStyle w:val="Heading2"/>
@@ -21831,18 +21921,18 @@
           <wp:inline>
             <wp:extent cx="5334000" cy="4267200"/>
             <wp:effectExtent b="0" l="0" r="0" t="0"/>
-            <wp:docPr descr="Sensibilité et Spécificité (ULNT1) selon l’étage métamérique" title="" id="142" name="Picture"/>
+            <wp:docPr descr="Sensibilité et Spécificité (ULNT1) selon l’étage métamérique" title="" id="144" name="Picture"/>
             <a:graphic>
               <a:graphicData uri="http://schemas.openxmlformats.org/drawingml/2006/picture">
                 <pic:pic>
                   <pic:nvPicPr>
-                    <pic:cNvPr descr="these_brieuc_last_recueil_files/figure-docx/level-grouped-plot-1.png" id="143" name="Picture"/>
+                    <pic:cNvPr descr="these_brieuc_last_recueil_files/figure-docx/level-grouped-plot-1.png" id="145" name="Picture"/>
                     <pic:cNvPicPr>
                       <a:picLocks noChangeArrowheads="1" noChangeAspect="1"/>
                     </pic:cNvPicPr>
                   </pic:nvPicPr>
                   <pic:blipFill>
-                    <a:blip r:embed="rId141"/>
+                    <a:blip r:embed="rId143"/>
                     <a:stretch>
                       <a:fillRect/>
                     </a:stretch>
@@ -21890,8 +21980,8 @@
         <w:br w:type="page"/>
       </w:r>
     </w:p>
-    <w:bookmarkEnd w:id="144"/>
-    <w:bookmarkStart w:id="147" w:name="X5f2088ebd1452b5ba2e72bca91cf173f1488185"/>
+    <w:bookmarkEnd w:id="146"/>
+    <w:bookmarkStart w:id="149" w:name="X5f2088ebd1452b5ba2e72bca91cf173f1488185"/>
     <w:p>
       <w:pPr>
         <w:pStyle w:val="Heading2"/>
@@ -22152,7 +22242,7 @@
         </w:tc>
       </w:tr>
     </w:tbl>
-    <w:bookmarkStart w:id="145" w:name="interprétation-4"/>
+    <w:bookmarkStart w:id="147" w:name="interprétation-4"/>
     <w:p>
       <w:pPr>
         <w:pStyle w:val="Heading3"/>
@@ -22253,8 +22343,8 @@
         <w:t xml:space="preserve">Cette étude doit être considérée comme une étape exploratoire robuste. Elle démontre une hiérarchie claire entre les tests, mais confirme qu’une étude de confirmation visant une précision étroite nécessiterait une cohorte plus large, d’environ 93 patients avec la prévalence observée, pour compenser une spécificité plus faible qu’attendu.</w:t>
       </w:r>
     </w:p>
-    <w:bookmarkEnd w:id="145"/>
-    <w:bookmarkStart w:id="146" w:name="X327af1bda9aaac52b4ba9f934de637f25ad4f79"/>
+    <w:bookmarkEnd w:id="147"/>
+    <w:bookmarkStart w:id="148" w:name="X327af1bda9aaac52b4ba9f934de637f25ad4f79"/>
     <w:p>
       <w:pPr>
         <w:pStyle w:val="Heading3"/>
@@ -22276,9 +22366,9 @@
         <w:br w:type="page"/>
       </w:r>
     </w:p>
-    <w:bookmarkEnd w:id="146"/>
-    <w:bookmarkEnd w:id="147"/>
-    <w:bookmarkStart w:id="167" w:name="Xa74f6e5e5a07d3b1e6f81174b7b050bbc6693ee"/>
+    <w:bookmarkEnd w:id="148"/>
+    <w:bookmarkEnd w:id="149"/>
+    <w:bookmarkStart w:id="169" w:name="Xa74f6e5e5a07d3b1e6f81174b7b050bbc6693ee"/>
     <w:p>
       <w:pPr>
         <w:pStyle w:val="Heading2"/>
@@ -22394,7 +22484,7 @@
         <w:t xml:space="preserve">final positif. Cette approche est volontairement stricte et doit être interprétée comme une analyse exploratoire.</w:t>
       </w:r>
     </w:p>
-    <w:bookmarkStart w:id="155" w:name="Xa192f37cf83a10b999fde97a2d384c51e445d4f"/>
+    <w:bookmarkStart w:id="157" w:name="Xa192f37cf83a10b999fde97a2d384c51e445d4f"/>
     <w:p>
       <w:pPr>
         <w:pStyle w:val="Heading3"/>
@@ -22463,7 +22553,7 @@
         <w:t xml:space="preserve">(26 cas positifs avec confirmation par infiltration et 26 cas négatifs du gold standard final).</w:t>
       </w:r>
     </w:p>
-    <w:bookmarkStart w:id="154" w:name="Xd66c688fc52a650573970ca45f422c6ebf5cd42"/>
+    <w:bookmarkStart w:id="156" w:name="Xd66c688fc52a650573970ca45f422c6ebf5cd42"/>
     <w:p>
       <w:pPr>
         <w:pStyle w:val="Heading4"/>
@@ -22518,7 +22608,7 @@
       <w:tr>
         <w:tc>
           <w:tcPr/>
-          <w:bookmarkStart w:id="148" w:name="tbl-strong-a1-indiv"/>
+          <w:bookmarkStart w:id="150" w:name="tbl-strong-a1-indiv"/>
           <w:p>
             <w:pPr>
               <w:jc w:val="center"/>
@@ -23017,7 +23107,7 @@
               </w:tc>
             </w:tr>
           </w:tbl>
-          <w:bookmarkEnd w:id="148"/>
+          <w:bookmarkEnd w:id="150"/>
           <w:p/>
         </w:tc>
       </w:tr>
@@ -23043,7 +23133,7 @@
       <w:tr>
         <w:tc>
           <w:tcPr/>
-          <w:bookmarkStart w:id="149" w:name="tbl-comp-a1-sensi"/>
+          <w:bookmarkStart w:id="151" w:name="tbl-comp-a1-sensi"/>
           <w:p>
             <w:pPr>
               <w:jc w:val="center"/>
@@ -23277,7 +23367,7 @@
               </w:tc>
             </w:tr>
           </w:tbl>
-          <w:bookmarkEnd w:id="149"/>
+          <w:bookmarkEnd w:id="151"/>
           <w:p/>
         </w:tc>
       </w:tr>
@@ -23303,7 +23393,7 @@
       <w:tr>
         <w:tc>
           <w:tcPr/>
-          <w:bookmarkStart w:id="150" w:name="tbl-strong-a1-comb"/>
+          <w:bookmarkStart w:id="152" w:name="tbl-strong-a1-comb"/>
           <w:p>
             <w:pPr>
               <w:jc w:val="center"/>
@@ -24453,7 +24543,7 @@
               </w:tc>
             </w:tr>
           </w:tbl>
-          <w:bookmarkEnd w:id="150"/>
+          <w:bookmarkEnd w:id="152"/>
           <w:p/>
         </w:tc>
       </w:tr>
@@ -24479,7 +24569,7 @@
       <w:tr>
         <w:tc>
           <w:tcPr/>
-          <w:bookmarkStart w:id="151" w:name="tbl-comp-a1-comb"/>
+          <w:bookmarkStart w:id="153" w:name="tbl-comp-a1-comb"/>
           <w:p>
             <w:pPr>
               <w:jc w:val="center"/>
@@ -25000,7 +25090,7 @@
               </w:tc>
             </w:tr>
           </w:tbl>
-          <w:bookmarkEnd w:id="151"/>
+          <w:bookmarkEnd w:id="153"/>
           <w:p/>
         </w:tc>
       </w:tr>
@@ -25026,7 +25116,7 @@
       <w:tr>
         <w:tc>
           <w:tcPr/>
-          <w:bookmarkStart w:id="152" w:name="tbl-strong-a1-score"/>
+          <w:bookmarkStart w:id="154" w:name="tbl-strong-a1-score"/>
           <w:p>
             <w:pPr>
               <w:jc w:val="center"/>
@@ -25525,7 +25615,7 @@
               </w:tc>
             </w:tr>
           </w:tbl>
-          <w:bookmarkEnd w:id="152"/>
+          <w:bookmarkEnd w:id="154"/>
           <w:p/>
         </w:tc>
       </w:tr>
@@ -25551,7 +25641,7 @@
       <w:tr>
         <w:tc>
           <w:tcPr/>
-          <w:bookmarkStart w:id="153" w:name="tbl-comp-a1-score"/>
+          <w:bookmarkStart w:id="155" w:name="tbl-comp-a1-score"/>
           <w:p>
             <w:pPr>
               <w:jc w:val="center"/>
@@ -25785,7 +25875,7 @@
               </w:tc>
             </w:tr>
           </w:tbl>
-          <w:bookmarkEnd w:id="153"/>
+          <w:bookmarkEnd w:id="155"/>
           <w:p/>
         </w:tc>
       </w:tr>
@@ -25795,9 +25885,9 @@
         <w:br w:type="page"/>
       </w:r>
     </w:p>
-    <w:bookmarkEnd w:id="154"/>
-    <w:bookmarkEnd w:id="155"/>
-    <w:bookmarkStart w:id="166" w:name="Xfc1f0e7fb5d30fbf15f6f63ce4005f3bfc8dd76"/>
+    <w:bookmarkEnd w:id="156"/>
+    <w:bookmarkEnd w:id="157"/>
+    <w:bookmarkStart w:id="168" w:name="Xfc1f0e7fb5d30fbf15f6f63ce4005f3bfc8dd76"/>
     <w:p>
       <w:pPr>
         <w:pStyle w:val="Heading3"/>
@@ -25868,7 +25958,7 @@
         <w:t xml:space="preserve">), avec 26 cas positifs confirmés par infiltration et 45 cas classés négatifs dans cette définition secondaire.</w:t>
       </w:r>
     </w:p>
-    <w:bookmarkStart w:id="165" w:name="X8dc8954848c8982c78d0f98ab6d387465f3dc1d"/>
+    <w:bookmarkStart w:id="167" w:name="X8dc8954848c8982c78d0f98ab6d387465f3dc1d"/>
     <w:p>
       <w:pPr>
         <w:pStyle w:val="Heading4"/>
@@ -25995,7 +26085,7 @@
       <w:tr>
         <w:tc>
           <w:tcPr/>
-          <w:bookmarkStart w:id="156" w:name="tbl-strong-a2-indiv"/>
+          <w:bookmarkStart w:id="158" w:name="tbl-strong-a2-indiv"/>
           <w:p>
             <w:pPr>
               <w:jc w:val="center"/>
@@ -26494,7 +26584,7 @@
               </w:tc>
             </w:tr>
           </w:tbl>
-          <w:bookmarkEnd w:id="156"/>
+          <w:bookmarkEnd w:id="158"/>
           <w:p/>
         </w:tc>
       </w:tr>
@@ -26520,7 +26610,7 @@
       <w:tr>
         <w:tc>
           <w:tcPr/>
-          <w:bookmarkStart w:id="157" w:name="tbl-comp-a2-spe"/>
+          <w:bookmarkStart w:id="159" w:name="tbl-comp-a2-spe"/>
           <w:p>
             <w:pPr>
               <w:jc w:val="center"/>
@@ -26754,7 +26844,7 @@
               </w:tc>
             </w:tr>
           </w:tbl>
-          <w:bookmarkEnd w:id="157"/>
+          <w:bookmarkEnd w:id="159"/>
           <w:p/>
         </w:tc>
       </w:tr>
@@ -26780,7 +26870,7 @@
       <w:tr>
         <w:tc>
           <w:tcPr/>
-          <w:bookmarkStart w:id="158" w:name="tbl-strong-a2-comb"/>
+          <w:bookmarkStart w:id="160" w:name="tbl-strong-a2-comb"/>
           <w:p>
             <w:pPr>
               <w:jc w:val="center"/>
@@ -27930,7 +28020,7 @@
               </w:tc>
             </w:tr>
           </w:tbl>
-          <w:bookmarkEnd w:id="158"/>
+          <w:bookmarkEnd w:id="160"/>
           <w:p/>
         </w:tc>
       </w:tr>
@@ -27956,7 +28046,7 @@
       <w:tr>
         <w:tc>
           <w:tcPr/>
-          <w:bookmarkStart w:id="159" w:name="tbl-comp-a2-comb"/>
+          <w:bookmarkStart w:id="161" w:name="tbl-comp-a2-comb"/>
           <w:p>
             <w:pPr>
               <w:jc w:val="center"/>
@@ -28792,7 +28882,7 @@
               </w:tc>
             </w:tr>
           </w:tbl>
-          <w:bookmarkEnd w:id="159"/>
+          <w:bookmarkEnd w:id="161"/>
           <w:p/>
         </w:tc>
       </w:tr>
@@ -28818,7 +28908,7 @@
       <w:tr>
         <w:tc>
           <w:tcPr/>
-          <w:bookmarkStart w:id="160" w:name="tbl-strong-a2-score"/>
+          <w:bookmarkStart w:id="162" w:name="tbl-strong-a2-score"/>
           <w:p>
             <w:pPr>
               <w:jc w:val="center"/>
@@ -29317,7 +29407,7 @@
               </w:tc>
             </w:tr>
           </w:tbl>
-          <w:bookmarkEnd w:id="160"/>
+          <w:bookmarkEnd w:id="162"/>
           <w:p/>
         </w:tc>
       </w:tr>
@@ -29343,7 +29433,7 @@
       <w:tr>
         <w:tc>
           <w:tcPr/>
-          <w:bookmarkStart w:id="161" w:name="tbl-comp-a2-score"/>
+          <w:bookmarkStart w:id="163" w:name="tbl-comp-a2-score"/>
           <w:p>
             <w:pPr>
               <w:jc w:val="center"/>
@@ -29710,13 +29800,13 @@
               </w:tc>
             </w:tr>
           </w:tbl>
-          <w:bookmarkEnd w:id="161"/>
+          <w:bookmarkEnd w:id="163"/>
           <w:p/>
         </w:tc>
       </w:tr>
     </w:tbl>
-    <w:bookmarkStart w:id="164" w:name="refs"/>
-    <w:bookmarkStart w:id="163" w:name="X130cc6218cdcb99520dccce7f8b213552eaa63a"/>
+    <w:bookmarkStart w:id="166" w:name="refs"/>
+    <w:bookmarkStart w:id="165" w:name="X130cc6218cdcb99520dccce7f8b213552eaa63a"/>
     <w:p>
       <w:pPr>
         <w:pStyle w:val="Bibliography"/>
@@ -29730,7 +29820,7 @@
       <w:r>
         <w:t xml:space="preserve">“</w:t>
       </w:r>
-      <w:hyperlink r:id="rId162">
+      <w:hyperlink r:id="rId164">
         <w:r>
           <w:rPr>
             <w:rStyle w:val="Hyperlink"/>
@@ -29758,12 +29848,12 @@
         <w:t xml:space="preserve">33 (1): 159–74.</w:t>
       </w:r>
     </w:p>
-    <w:bookmarkEnd w:id="163"/>
-    <w:bookmarkEnd w:id="164"/>
     <w:bookmarkEnd w:id="165"/>
     <w:bookmarkEnd w:id="166"/>
     <w:bookmarkEnd w:id="167"/>
     <w:bookmarkEnd w:id="168"/>
+    <w:bookmarkEnd w:id="169"/>
+    <w:bookmarkEnd w:id="170"/>
     <w:sectPr>
       <w:footnotePr>
         <w:numRestart w:val="eachSect"/>

</xml_diff>

<commit_message>
Finalize public repository cleanup (#5)
Consolidate report artifacts, remove local metadata and tracked system files, and prepare the repository for public access.
</commit_message>
<xml_diff>
--- a/docs/these_brieuc_last_recueil.docx
+++ b/docs/these_brieuc_last_recueil.docx
@@ -2128,7 +2128,7 @@
       </w:r>
     </w:p>
     <w:bookmarkEnd w:id="29"/>
-    <w:bookmarkStart w:id="168" w:name="résultats"/>
+    <w:bookmarkStart w:id="170" w:name="résultats"/>
     <w:p>
       <w:pPr>
         <w:pStyle w:val="Heading1"/>
@@ -11417,7 +11417,7 @@
       </w:r>
     </w:p>
     <w:bookmarkEnd w:id="95"/>
-    <w:bookmarkStart w:id="112" w:name="combinaisons-et-score-de-positivité-ulnt"/>
+    <w:bookmarkStart w:id="114" w:name="combinaisons-et-score-de-positivité-ulnt"/>
     <w:p>
       <w:pPr>
         <w:pStyle w:val="Heading2"/>
@@ -13627,7 +13627,7 @@
       </w:r>
     </w:p>
     <w:bookmarkEnd w:id="96"/>
-    <w:bookmarkStart w:id="111" w:name="X03dbcbbf9db0121bf925d0d666616bf3a5f62d7"/>
+    <w:bookmarkStart w:id="113" w:name="X03dbcbbf9db0121bf925d0d666616bf3a5f62d7"/>
     <w:p>
       <w:pPr>
         <w:pStyle w:val="Heading3"/>
@@ -14817,7 +14817,7 @@
       </w:r>
     </w:p>
     <w:bookmarkEnd w:id="100"/>
-    <w:bookmarkStart w:id="110" w:name="gain-de-spécificité"/>
+    <w:bookmarkStart w:id="112" w:name="gain-de-spécificité"/>
     <w:p>
       <w:pPr>
         <w:pStyle w:val="Heading4"/>
@@ -15391,63 +15391,153 @@
         <w:t xml:space="preserve">Courbe ROC du score global (Nombre de tests positifs)</w:t>
       </w:r>
     </w:p>
-    <w:p>
-      <w:pPr>
-        <w:pStyle w:val="BodyText"/>
-      </w:pPr>
-      <w:r>
-        <w:t xml:space="preserve">::: {. callout-important title=</w:t>
-      </w:r>
-      <w:r>
-        <w:t xml:space="preserve">“ATTENTION BRIEUC”</w:t>
-      </w:r>
-      <w:r>
-        <w:t xml:space="preserve">}</w:t>
-      </w:r>
-      <w:r>
-        <w:t xml:space="preserve"> </w:t>
-      </w:r>
-      <w:r>
-        <w:t xml:space="preserve">- Les courbes ROC c’est vraiment pas terrible pour un score discret (c’est à dire uniquement des nombres entiers)</w:t>
-      </w:r>
-    </w:p>
-    <w:p>
-      <w:pPr>
-        <w:numPr>
-          <w:ilvl w:val="0"/>
-          <w:numId w:val="1031"/>
-        </w:numPr>
-      </w:pPr>
-      <w:r>
-        <w:t xml:space="preserve">Donc pas très joli : je le mettrais pas</w:t>
-      </w:r>
-    </w:p>
-    <w:p>
-      <w:pPr>
-        <w:numPr>
-          <w:ilvl w:val="0"/>
-          <w:numId w:val="1031"/>
-        </w:numPr>
-      </w:pPr>
-      <w:r>
-        <w:t xml:space="preserve">ÇA VA C’EST ÉCRIT ASSEZ GROS ??</w:t>
-      </w:r>
-      <w:r>
-        <w:t xml:space="preserve"> </w:t>
-      </w:r>
-      <w:r>
-        <w:t xml:space="preserve">:::</w:t>
-      </w:r>
-    </w:p>
+    <w:tbl>
+      <w:tblPr>
+        <w:tblStyle w:val="Table"/>
+        <w:tblLook w:firstRow="0" w:lastRow="0" w:firstColumn="0" w:lastColumn="0" w:noHBand="0" w:noVBand="0" w:val="0000"/>
+        <w:tblBorders>
+          <w:top w:val="single" w:sz="4" w:space="0" w:color="CC1914"/>
+          <w:left w:val="single" w:sz="24" w:space="0" w:color="CC1914"/>
+          <w:bottom w:val="single" w:sz="4" w:space="0" w:color="CC1914"/>
+          <w:right w:val="single" w:sz="4" w:space="0" w:color="CC1914"/>
+        </w:tblBorders>
+        <w:tblCellMar>
+          <w:left w:w="144" w:type="dxa"/>
+          <w:right w:w="144" w:type="dxa"/>
+        </w:tblCellMar>
+        <w:tblLook w:firstRow="0" w:lastRow="0" w:firstColumn="0" w:lastColumn="0" w:noHBand="0" w:noVBand="0" w:val="0000"/>
+      </w:tblPr>
+      <w:tr>
+        <w:trPr>
+          <w:cantSplit/>
+        </w:trPr>
+        <w:tc>
+          <w:tcPr>
+            <w:shd w:color="auto" w:fill="f7dddc" w:val="clear"/>
+            <w:tcMar>
+              <w:top w:w="92" w:type="dxa"/>
+              <w:bottom w:w="92" w:type="dxa"/>
+            </w:tcMar>
+          </w:tcPr>
+          <w:p>
+            <w:pPr>
+              <w:pStyle w:val="BodyText"/>
+            </w:pPr>
+            <w:pPr>
+              <w:spacing w:before="0" w:after="0"/>
+              <w:textAlignment w:val="center"/>
+            </w:pPr>
+            <w:r>
+              <w:drawing>
+                <wp:inline>
+                  <wp:extent cx="152400" cy="152400"/>
+                  <wp:effectExtent b="0" l="0" r="0" t="0"/>
+                  <wp:docPr descr="" title="" id="110" name="Picture"/>
+                  <a:graphic>
+                    <a:graphicData uri="http://schemas.openxmlformats.org/drawingml/2006/picture">
+                      <pic:pic>
+                        <pic:nvPicPr>
+                          <pic:cNvPr descr="/Applications/quarto/share/formats/docx/important.png" id="111" name="Picture"/>
+                          <pic:cNvPicPr>
+                            <a:picLocks noChangeArrowheads="1" noChangeAspect="1"/>
+                          </pic:cNvPicPr>
+                        </pic:nvPicPr>
+                        <pic:blipFill>
+                          <a:blip r:embed="rId65"/>
+                          <a:stretch>
+                            <a:fillRect/>
+                          </a:stretch>
+                        </pic:blipFill>
+                        <pic:spPr bwMode="auto">
+                          <a:xfrm>
+                            <a:off x="0" y="0"/>
+                            <a:ext cx="152400" cy="152400"/>
+                          </a:xfrm>
+                          <a:prstGeom prst="rect">
+                            <a:avLst/>
+                          </a:prstGeom>
+                          <a:noFill/>
+                          <a:ln w="9525">
+                            <a:noFill/>
+                            <a:headEnd/>
+                            <a:tailEnd/>
+                          </a:ln>
+                        </pic:spPr>
+                      </pic:pic>
+                    </a:graphicData>
+                  </a:graphic>
+                </wp:inline>
+              </w:drawing>
+            </w:r>
+            <w:r>
+              <w:t xml:space="preserve"> </w:t>
+            </w:r>
+            <w:r>
+              <w:t xml:space="preserve"> </w:t>
+            </w:r>
+            <w:r>
+              <w:t xml:space="preserve">ATTENTION BRIEUC</w:t>
+            </w:r>
+          </w:p>
+        </w:tc>
+      </w:tr>
+      <w:tr>
+        <w:trPr>
+          <w:cantSplit/>
+        </w:trPr>
+        <w:tc>
+          <w:tcPr>
+            <w:tcMar>
+              <w:top w:w="108" w:type="dxa"/>
+              <w:bottom w:w="108" w:type="dxa"/>
+            </w:tcMar>
+          </w:tcPr>
+          <w:p>
+            <w:pPr>
+              <w:numPr>
+                <w:ilvl w:val="0"/>
+                <w:numId w:val="1031"/>
+              </w:numPr>
+            </w:pPr>
+            <w:r>
+              <w:t xml:space="preserve">Les courbes ROC c’est vraiment pas terrible pour un score discret (c’est à dire uniquement des nombres entiers)</w:t>
+            </w:r>
+          </w:p>
+          <w:p>
+            <w:pPr>
+              <w:numPr>
+                <w:ilvl w:val="0"/>
+                <w:numId w:val="1031"/>
+              </w:numPr>
+            </w:pPr>
+            <w:r>
+              <w:t xml:space="preserve">Donc pas très joli : je le mettrais pas</w:t>
+            </w:r>
+          </w:p>
+          <w:p>
+            <w:pPr>
+              <w:numPr>
+                <w:ilvl w:val="0"/>
+                <w:numId w:val="1031"/>
+              </w:numPr>
+            </w:pPr>
+            <w:r>
+              <w:t xml:space="preserve">ÇA VA C’EST ÉCRIT ASSEZ GROS ??</w:t>
+            </w:r>
+          </w:p>
+          <w:p/>
+        </w:tc>
+      </w:tr>
+    </w:tbl>
     <w:p>
       <w:r>
         <w:br w:type="page"/>
       </w:r>
     </w:p>
-    <w:bookmarkEnd w:id="110"/>
-    <w:bookmarkEnd w:id="111"/>
     <w:bookmarkEnd w:id="112"/>
-    <w:bookmarkStart w:id="140" w:name="Xd9c2445cfe2dcec6a85ff49d15ae9240c0cf3af"/>
+    <w:bookmarkEnd w:id="113"/>
+    <w:bookmarkEnd w:id="114"/>
+    <w:bookmarkStart w:id="142" w:name="Xd9c2445cfe2dcec6a85ff49d15ae9240c0cf3af"/>
     <w:p>
       <w:pPr>
         <w:pStyle w:val="Heading2"/>
@@ -15464,7 +15554,7 @@
         <w:t xml:space="preserve">Résultats par niveau métamérique, exploratoires du fait des effectifs très faibles à certains niveaux.</w:t>
       </w:r>
     </w:p>
-    <w:bookmarkStart w:id="119" w:name="résumé-descriptif-par-niveau-métamérique"/>
+    <w:bookmarkStart w:id="121" w:name="résumé-descriptif-par-niveau-métamérique"/>
     <w:p>
       <w:pPr>
         <w:pStyle w:val="Heading3"/>
@@ -15954,18 +16044,18 @@
           <wp:inline>
             <wp:extent cx="5334000" cy="4267200"/>
             <wp:effectExtent b="0" l="0" r="0" t="0"/>
-            <wp:docPr descr="Effectif de NCB par niveau métamérique" title="" id="114" name="Picture"/>
+            <wp:docPr descr="Effectif de NCB par niveau métamérique" title="" id="116" name="Picture"/>
             <a:graphic>
               <a:graphicData uri="http://schemas.openxmlformats.org/drawingml/2006/picture">
                 <pic:pic>
                   <pic:nvPicPr>
-                    <pic:cNvPr descr="these_brieuc_last_recueil_files/figure-docx/results-by-level-rate-1.png" id="115" name="Picture"/>
+                    <pic:cNvPr descr="these_brieuc_last_recueil_files/figure-docx/results-by-level-rate-1.png" id="117" name="Picture"/>
                     <pic:cNvPicPr>
                       <a:picLocks noChangeArrowheads="1" noChangeAspect="1"/>
                     </pic:cNvPicPr>
                   </pic:nvPicPr>
                   <pic:blipFill>
-                    <a:blip r:embed="rId113"/>
+                    <a:blip r:embed="rId115"/>
                     <a:stretch>
                       <a:fillRect/>
                     </a:stretch>
@@ -16009,18 +16099,18 @@
           <wp:inline>
             <wp:extent cx="5334000" cy="4267200"/>
             <wp:effectExtent b="0" l="0" r="0" t="0"/>
-            <wp:docPr descr="Distribution du score ULNT selon le niveau métamérique" title="" id="117" name="Picture"/>
+            <wp:docPr descr="Distribution du score ULNT selon le niveau métamérique" title="" id="119" name="Picture"/>
             <a:graphic>
               <a:graphicData uri="http://schemas.openxmlformats.org/drawingml/2006/picture">
                 <pic:pic>
                   <pic:nvPicPr>
-                    <pic:cNvPr descr="these_brieuc_last_recueil_files/figure-docx/results-by-level-count-1.png" id="118" name="Picture"/>
+                    <pic:cNvPr descr="these_brieuc_last_recueil_files/figure-docx/results-by-level-count-1.png" id="120" name="Picture"/>
                     <pic:cNvPicPr>
                       <a:picLocks noChangeArrowheads="1" noChangeAspect="1"/>
                     </pic:cNvPicPr>
                   </pic:nvPicPr>
                   <pic:blipFill>
-                    <a:blip r:embed="rId116"/>
+                    <a:blip r:embed="rId118"/>
                     <a:stretch>
                       <a:fillRect/>
                     </a:stretch>
@@ -16152,8 +16242,8 @@
         <w:br w:type="page"/>
       </w:r>
     </w:p>
-    <w:bookmarkEnd w:id="119"/>
-    <w:bookmarkStart w:id="128" w:name="X24df2f30bf32bdef8b2f19a40875147e62cc664"/>
+    <w:bookmarkEnd w:id="121"/>
+    <w:bookmarkStart w:id="130" w:name="X24df2f30bf32bdef8b2f19a40875147e62cc664"/>
     <w:p>
       <w:pPr>
         <w:pStyle w:val="Heading3"/>
@@ -16183,7 +16273,7 @@
       <w:tr>
         <w:tc>
           <w:tcPr/>
-          <w:bookmarkStart w:id="123" w:name="fig-gs-positive-level"/>
+          <w:bookmarkStart w:id="125" w:name="fig-gs-positive-level"/>
           <w:p>
             <w:pPr>
               <w:pStyle w:val="Compact"/>
@@ -16194,18 +16284,18 @@
                 <wp:inline>
                   <wp:extent cx="5334000" cy="4267200"/>
                   <wp:effectExtent b="0" l="0" r="0" t="0"/>
-                  <wp:docPr descr="" title="" id="121" name="Picture"/>
+                  <wp:docPr descr="" title="" id="123" name="Picture"/>
                   <a:graphic>
                     <a:graphicData uri="http://schemas.openxmlformats.org/drawingml/2006/picture">
                       <pic:pic>
                         <pic:nvPicPr>
-                          <pic:cNvPr descr="these_brieuc_last_recueil_files/figure-docx/fig-gs-positive-level-1.png" id="122" name="Picture"/>
+                          <pic:cNvPr descr="these_brieuc_last_recueil_files/figure-docx/fig-gs-positive-level-1.png" id="124" name="Picture"/>
                           <pic:cNvPicPr>
                             <a:picLocks noChangeArrowheads="1" noChangeAspect="1"/>
                           </pic:cNvPicPr>
                         </pic:nvPicPr>
                         <pic:blipFill>
-                          <a:blip r:embed="rId120"/>
+                          <a:blip r:embed="rId122"/>
                           <a:stretch>
                             <a:fillRect/>
                           </a:stretch>
@@ -16245,7 +16335,7 @@
               <w:t xml:space="preserve">Figure 2: Répartition des niveaux métamériques uniquement chez les cas confirmés</w:t>
             </w:r>
           </w:p>
-          <w:bookmarkEnd w:id="123"/>
+          <w:bookmarkEnd w:id="125"/>
         </w:tc>
       </w:tr>
     </w:tbl>
@@ -16262,7 +16352,7 @@
       <w:tr>
         <w:tc>
           <w:tcPr/>
-          <w:bookmarkStart w:id="127" w:name="fig-gs-positive-score"/>
+          <w:bookmarkStart w:id="129" w:name="fig-gs-positive-score"/>
           <w:p>
             <w:pPr>
               <w:pStyle w:val="Compact"/>
@@ -16273,18 +16363,18 @@
                 <wp:inline>
                   <wp:extent cx="5334000" cy="4267200"/>
                   <wp:effectExtent b="0" l="0" r="0" t="0"/>
-                  <wp:docPr descr="" title="" id="125" name="Picture"/>
+                  <wp:docPr descr="" title="" id="127" name="Picture"/>
                   <a:graphic>
                     <a:graphicData uri="http://schemas.openxmlformats.org/drawingml/2006/picture">
                       <pic:pic>
                         <pic:nvPicPr>
-                          <pic:cNvPr descr="these_brieuc_last_recueil_files/figure-docx/fig-gs-positive-score-1.png" id="126" name="Picture"/>
+                          <pic:cNvPr descr="these_brieuc_last_recueil_files/figure-docx/fig-gs-positive-score-1.png" id="128" name="Picture"/>
                           <pic:cNvPicPr>
                             <a:picLocks noChangeArrowheads="1" noChangeAspect="1"/>
                           </pic:cNvPicPr>
                         </pic:nvPicPr>
                         <pic:blipFill>
-                          <a:blip r:embed="rId124"/>
+                          <a:blip r:embed="rId126"/>
                           <a:stretch>
                             <a:fillRect/>
                           </a:stretch>
@@ -16324,12 +16414,12 @@
               <w:t xml:space="preserve">Figure 3: Score ULNT par niveau chez les patients confirmés</w:t>
             </w:r>
           </w:p>
-          <w:bookmarkEnd w:id="127"/>
+          <w:bookmarkEnd w:id="129"/>
         </w:tc>
       </w:tr>
     </w:tbl>
-    <w:bookmarkEnd w:id="128"/>
-    <w:bookmarkStart w:id="134" w:name="X703fe49374d10f2f062ed2a4e9ff6878570202b"/>
+    <w:bookmarkEnd w:id="130"/>
+    <w:bookmarkStart w:id="136" w:name="X703fe49374d10f2f062ed2a4e9ff6878570202b"/>
     <w:p>
       <w:pPr>
         <w:pStyle w:val="Heading3"/>
@@ -16359,30 +16449,30 @@
       <w:tr>
         <w:tc>
           <w:tcPr/>
-          <w:bookmarkStart w:id="133" w:name="fig-level-performance-individual"/>
-          <w:p>
-            <w:pPr>
-              <w:pStyle w:val="Compact"/>
-              <w:jc w:val="center"/>
-            </w:pPr>
-            <w:bookmarkStart w:id="132" w:name="fig-level-performance-individual"/>
+          <w:bookmarkStart w:id="135" w:name="fig-level-performance-individual"/>
+          <w:p>
+            <w:pPr>
+              <w:pStyle w:val="Compact"/>
+              <w:jc w:val="center"/>
+            </w:pPr>
+            <w:bookmarkStart w:id="134" w:name="fig-level-performance-individual"/>
             <w:r>
               <w:drawing>
                 <wp:inline>
                   <wp:extent cx="5334000" cy="7467600"/>
                   <wp:effectExtent b="0" l="0" r="0" t="0"/>
-                  <wp:docPr descr="" title="" id="130" name="Picture"/>
+                  <wp:docPr descr="" title="" id="132" name="Picture"/>
                   <a:graphic>
                     <a:graphicData uri="http://schemas.openxmlformats.org/drawingml/2006/picture">
                       <pic:pic>
                         <pic:nvPicPr>
-                          <pic:cNvPr descr="these_brieuc_last_recueil_files/figure-docx/fig-level-performance-individual-1.png" id="131" name="Picture"/>
+                          <pic:cNvPr descr="these_brieuc_last_recueil_files/figure-docx/fig-level-performance-individual-1.png" id="133" name="Picture"/>
                           <pic:cNvPicPr>
                             <a:picLocks noChangeArrowheads="1" noChangeAspect="1"/>
                           </pic:cNvPicPr>
                         </pic:nvPicPr>
                         <pic:blipFill>
-                          <a:blip r:embed="rId129"/>
+                          <a:blip r:embed="rId131"/>
                           <a:stretch>
                             <a:fillRect/>
                           </a:stretch>
@@ -16408,7 +16498,7 @@
                 </wp:inline>
               </w:drawing>
             </w:r>
-            <w:bookmarkEnd w:id="132"/>
+            <w:bookmarkEnd w:id="134"/>
           </w:p>
           <w:p>
             <w:pPr>
@@ -16423,7 +16513,7 @@
               <w:t xml:space="preserve">Figure 4</w:t>
             </w:r>
           </w:p>
-          <w:bookmarkEnd w:id="133"/>
+          <w:bookmarkEnd w:id="135"/>
         </w:tc>
       </w:tr>
     </w:tbl>
@@ -16432,8 +16522,8 @@
         <w:br w:type="page"/>
       </w:r>
     </w:p>
-    <w:bookmarkEnd w:id="134"/>
-    <w:bookmarkStart w:id="135" w:name="X764f10c84694496ac6af7847083466b3b77ca36"/>
+    <w:bookmarkEnd w:id="136"/>
+    <w:bookmarkStart w:id="137" w:name="X764f10c84694496ac6af7847083466b3b77ca36"/>
     <w:p>
       <w:pPr>
         <w:pStyle w:val="Heading3"/>
@@ -18873,8 +18963,8 @@
         <w:br w:type="page"/>
       </w:r>
     </w:p>
-    <w:bookmarkEnd w:id="135"/>
-    <w:bookmarkStart w:id="139" w:name="Xf6491717f535a2e18f273658a84a918bff84356"/>
+    <w:bookmarkEnd w:id="137"/>
+    <w:bookmarkStart w:id="141" w:name="Xf6491717f535a2e18f273658a84a918bff84356"/>
     <w:p>
       <w:pPr>
         <w:pStyle w:val="Heading3"/>
@@ -18892,18 +18982,18 @@
           <wp:inline>
             <wp:extent cx="5334000" cy="4267200"/>
             <wp:effectExtent b="0" l="0" r="0" t="0"/>
-            <wp:docPr descr="Sensibilité et spécificité par niveau métamérique pour chaque test" title="" id="137" name="Picture"/>
+            <wp:docPr descr="Sensibilité et spécificité par niveau métamérique pour chaque test" title="" id="139" name="Picture"/>
             <a:graphic>
               <a:graphicData uri="http://schemas.openxmlformats.org/drawingml/2006/picture">
                 <pic:pic>
                   <pic:nvPicPr>
-                    <pic:cNvPr descr="these_brieuc_last_recueil_files/figure-docx/results-by-level-test-metric-plot-1.png" id="138" name="Picture"/>
+                    <pic:cNvPr descr="these_brieuc_last_recueil_files/figure-docx/results-by-level-test-metric-plot-1.png" id="140" name="Picture"/>
                     <pic:cNvPicPr>
                       <a:picLocks noChangeArrowheads="1" noChangeAspect="1"/>
                     </pic:cNvPicPr>
                   </pic:nvPicPr>
                   <pic:blipFill>
-                    <a:blip r:embed="rId136"/>
+                    <a:blip r:embed="rId138"/>
                     <a:stretch>
                       <a:fillRect/>
                     </a:stretch>
@@ -21525,9 +21615,9 @@
         <w:br w:type="page"/>
       </w:r>
     </w:p>
-    <w:bookmarkEnd w:id="139"/>
-    <w:bookmarkEnd w:id="140"/>
-    <w:bookmarkStart w:id="144" w:name="analyses-par-niveau-métamérique-regroupé"/>
+    <w:bookmarkEnd w:id="141"/>
+    <w:bookmarkEnd w:id="142"/>
+    <w:bookmarkStart w:id="146" w:name="analyses-par-niveau-métamérique-regroupé"/>
     <w:p>
       <w:pPr>
         <w:pStyle w:val="Heading2"/>
@@ -21831,18 +21921,18 @@
           <wp:inline>
             <wp:extent cx="5334000" cy="4267200"/>
             <wp:effectExtent b="0" l="0" r="0" t="0"/>
-            <wp:docPr descr="Sensibilité et Spécificité (ULNT1) selon l’étage métamérique" title="" id="142" name="Picture"/>
+            <wp:docPr descr="Sensibilité et Spécificité (ULNT1) selon l’étage métamérique" title="" id="144" name="Picture"/>
             <a:graphic>
               <a:graphicData uri="http://schemas.openxmlformats.org/drawingml/2006/picture">
                 <pic:pic>
                   <pic:nvPicPr>
-                    <pic:cNvPr descr="these_brieuc_last_recueil_files/figure-docx/level-grouped-plot-1.png" id="143" name="Picture"/>
+                    <pic:cNvPr descr="these_brieuc_last_recueil_files/figure-docx/level-grouped-plot-1.png" id="145" name="Picture"/>
                     <pic:cNvPicPr>
                       <a:picLocks noChangeArrowheads="1" noChangeAspect="1"/>
                     </pic:cNvPicPr>
                   </pic:nvPicPr>
                   <pic:blipFill>
-                    <a:blip r:embed="rId141"/>
+                    <a:blip r:embed="rId143"/>
                     <a:stretch>
                       <a:fillRect/>
                     </a:stretch>
@@ -21890,8 +21980,8 @@
         <w:br w:type="page"/>
       </w:r>
     </w:p>
-    <w:bookmarkEnd w:id="144"/>
-    <w:bookmarkStart w:id="147" w:name="X5f2088ebd1452b5ba2e72bca91cf173f1488185"/>
+    <w:bookmarkEnd w:id="146"/>
+    <w:bookmarkStart w:id="149" w:name="X5f2088ebd1452b5ba2e72bca91cf173f1488185"/>
     <w:p>
       <w:pPr>
         <w:pStyle w:val="Heading2"/>
@@ -22152,7 +22242,7 @@
         </w:tc>
       </w:tr>
     </w:tbl>
-    <w:bookmarkStart w:id="145" w:name="interprétation-4"/>
+    <w:bookmarkStart w:id="147" w:name="interprétation-4"/>
     <w:p>
       <w:pPr>
         <w:pStyle w:val="Heading3"/>
@@ -22253,8 +22343,8 @@
         <w:t xml:space="preserve">Cette étude doit être considérée comme une étape exploratoire robuste. Elle démontre une hiérarchie claire entre les tests, mais confirme qu’une étude de confirmation visant une précision étroite nécessiterait une cohorte plus large, d’environ 93 patients avec la prévalence observée, pour compenser une spécificité plus faible qu’attendu.</w:t>
       </w:r>
     </w:p>
-    <w:bookmarkEnd w:id="145"/>
-    <w:bookmarkStart w:id="146" w:name="X327af1bda9aaac52b4ba9f934de637f25ad4f79"/>
+    <w:bookmarkEnd w:id="147"/>
+    <w:bookmarkStart w:id="148" w:name="X327af1bda9aaac52b4ba9f934de637f25ad4f79"/>
     <w:p>
       <w:pPr>
         <w:pStyle w:val="Heading3"/>
@@ -22276,9 +22366,9 @@
         <w:br w:type="page"/>
       </w:r>
     </w:p>
-    <w:bookmarkEnd w:id="146"/>
-    <w:bookmarkEnd w:id="147"/>
-    <w:bookmarkStart w:id="167" w:name="Xa74f6e5e5a07d3b1e6f81174b7b050bbc6693ee"/>
+    <w:bookmarkEnd w:id="148"/>
+    <w:bookmarkEnd w:id="149"/>
+    <w:bookmarkStart w:id="169" w:name="Xa74f6e5e5a07d3b1e6f81174b7b050bbc6693ee"/>
     <w:p>
       <w:pPr>
         <w:pStyle w:val="Heading2"/>
@@ -22394,7 +22484,7 @@
         <w:t xml:space="preserve">final positif. Cette approche est volontairement stricte et doit être interprétée comme une analyse exploratoire.</w:t>
       </w:r>
     </w:p>
-    <w:bookmarkStart w:id="155" w:name="Xa192f37cf83a10b999fde97a2d384c51e445d4f"/>
+    <w:bookmarkStart w:id="157" w:name="Xa192f37cf83a10b999fde97a2d384c51e445d4f"/>
     <w:p>
       <w:pPr>
         <w:pStyle w:val="Heading3"/>
@@ -22463,7 +22553,7 @@
         <w:t xml:space="preserve">(26 cas positifs avec confirmation par infiltration et 26 cas négatifs du gold standard final).</w:t>
       </w:r>
     </w:p>
-    <w:bookmarkStart w:id="154" w:name="Xd66c688fc52a650573970ca45f422c6ebf5cd42"/>
+    <w:bookmarkStart w:id="156" w:name="Xd66c688fc52a650573970ca45f422c6ebf5cd42"/>
     <w:p>
       <w:pPr>
         <w:pStyle w:val="Heading4"/>
@@ -22518,7 +22608,7 @@
       <w:tr>
         <w:tc>
           <w:tcPr/>
-          <w:bookmarkStart w:id="148" w:name="tbl-strong-a1-indiv"/>
+          <w:bookmarkStart w:id="150" w:name="tbl-strong-a1-indiv"/>
           <w:p>
             <w:pPr>
               <w:jc w:val="center"/>
@@ -23017,7 +23107,7 @@
               </w:tc>
             </w:tr>
           </w:tbl>
-          <w:bookmarkEnd w:id="148"/>
+          <w:bookmarkEnd w:id="150"/>
           <w:p/>
         </w:tc>
       </w:tr>
@@ -23043,7 +23133,7 @@
       <w:tr>
         <w:tc>
           <w:tcPr/>
-          <w:bookmarkStart w:id="149" w:name="tbl-comp-a1-sensi"/>
+          <w:bookmarkStart w:id="151" w:name="tbl-comp-a1-sensi"/>
           <w:p>
             <w:pPr>
               <w:jc w:val="center"/>
@@ -23277,7 +23367,7 @@
               </w:tc>
             </w:tr>
           </w:tbl>
-          <w:bookmarkEnd w:id="149"/>
+          <w:bookmarkEnd w:id="151"/>
           <w:p/>
         </w:tc>
       </w:tr>
@@ -23303,7 +23393,7 @@
       <w:tr>
         <w:tc>
           <w:tcPr/>
-          <w:bookmarkStart w:id="150" w:name="tbl-strong-a1-comb"/>
+          <w:bookmarkStart w:id="152" w:name="tbl-strong-a1-comb"/>
           <w:p>
             <w:pPr>
               <w:jc w:val="center"/>
@@ -24453,7 +24543,7 @@
               </w:tc>
             </w:tr>
           </w:tbl>
-          <w:bookmarkEnd w:id="150"/>
+          <w:bookmarkEnd w:id="152"/>
           <w:p/>
         </w:tc>
       </w:tr>
@@ -24479,7 +24569,7 @@
       <w:tr>
         <w:tc>
           <w:tcPr/>
-          <w:bookmarkStart w:id="151" w:name="tbl-comp-a1-comb"/>
+          <w:bookmarkStart w:id="153" w:name="tbl-comp-a1-comb"/>
           <w:p>
             <w:pPr>
               <w:jc w:val="center"/>
@@ -25000,7 +25090,7 @@
               </w:tc>
             </w:tr>
           </w:tbl>
-          <w:bookmarkEnd w:id="151"/>
+          <w:bookmarkEnd w:id="153"/>
           <w:p/>
         </w:tc>
       </w:tr>
@@ -25026,7 +25116,7 @@
       <w:tr>
         <w:tc>
           <w:tcPr/>
-          <w:bookmarkStart w:id="152" w:name="tbl-strong-a1-score"/>
+          <w:bookmarkStart w:id="154" w:name="tbl-strong-a1-score"/>
           <w:p>
             <w:pPr>
               <w:jc w:val="center"/>
@@ -25525,7 +25615,7 @@
               </w:tc>
             </w:tr>
           </w:tbl>
-          <w:bookmarkEnd w:id="152"/>
+          <w:bookmarkEnd w:id="154"/>
           <w:p/>
         </w:tc>
       </w:tr>
@@ -25551,7 +25641,7 @@
       <w:tr>
         <w:tc>
           <w:tcPr/>
-          <w:bookmarkStart w:id="153" w:name="tbl-comp-a1-score"/>
+          <w:bookmarkStart w:id="155" w:name="tbl-comp-a1-score"/>
           <w:p>
             <w:pPr>
               <w:jc w:val="center"/>
@@ -25785,7 +25875,7 @@
               </w:tc>
             </w:tr>
           </w:tbl>
-          <w:bookmarkEnd w:id="153"/>
+          <w:bookmarkEnd w:id="155"/>
           <w:p/>
         </w:tc>
       </w:tr>
@@ -25795,9 +25885,9 @@
         <w:br w:type="page"/>
       </w:r>
     </w:p>
-    <w:bookmarkEnd w:id="154"/>
-    <w:bookmarkEnd w:id="155"/>
-    <w:bookmarkStart w:id="166" w:name="Xfc1f0e7fb5d30fbf15f6f63ce4005f3bfc8dd76"/>
+    <w:bookmarkEnd w:id="156"/>
+    <w:bookmarkEnd w:id="157"/>
+    <w:bookmarkStart w:id="168" w:name="Xfc1f0e7fb5d30fbf15f6f63ce4005f3bfc8dd76"/>
     <w:p>
       <w:pPr>
         <w:pStyle w:val="Heading3"/>
@@ -25868,7 +25958,7 @@
         <w:t xml:space="preserve">), avec 26 cas positifs confirmés par infiltration et 45 cas classés négatifs dans cette définition secondaire.</w:t>
       </w:r>
     </w:p>
-    <w:bookmarkStart w:id="165" w:name="X8dc8954848c8982c78d0f98ab6d387465f3dc1d"/>
+    <w:bookmarkStart w:id="167" w:name="X8dc8954848c8982c78d0f98ab6d387465f3dc1d"/>
     <w:p>
       <w:pPr>
         <w:pStyle w:val="Heading4"/>
@@ -25995,7 +26085,7 @@
       <w:tr>
         <w:tc>
           <w:tcPr/>
-          <w:bookmarkStart w:id="156" w:name="tbl-strong-a2-indiv"/>
+          <w:bookmarkStart w:id="158" w:name="tbl-strong-a2-indiv"/>
           <w:p>
             <w:pPr>
               <w:jc w:val="center"/>
@@ -26494,7 +26584,7 @@
               </w:tc>
             </w:tr>
           </w:tbl>
-          <w:bookmarkEnd w:id="156"/>
+          <w:bookmarkEnd w:id="158"/>
           <w:p/>
         </w:tc>
       </w:tr>
@@ -26520,7 +26610,7 @@
       <w:tr>
         <w:tc>
           <w:tcPr/>
-          <w:bookmarkStart w:id="157" w:name="tbl-comp-a2-spe"/>
+          <w:bookmarkStart w:id="159" w:name="tbl-comp-a2-spe"/>
           <w:p>
             <w:pPr>
               <w:jc w:val="center"/>
@@ -26754,7 +26844,7 @@
               </w:tc>
             </w:tr>
           </w:tbl>
-          <w:bookmarkEnd w:id="157"/>
+          <w:bookmarkEnd w:id="159"/>
           <w:p/>
         </w:tc>
       </w:tr>
@@ -26780,7 +26870,7 @@
       <w:tr>
         <w:tc>
           <w:tcPr/>
-          <w:bookmarkStart w:id="158" w:name="tbl-strong-a2-comb"/>
+          <w:bookmarkStart w:id="160" w:name="tbl-strong-a2-comb"/>
           <w:p>
             <w:pPr>
               <w:jc w:val="center"/>
@@ -27930,7 +28020,7 @@
               </w:tc>
             </w:tr>
           </w:tbl>
-          <w:bookmarkEnd w:id="158"/>
+          <w:bookmarkEnd w:id="160"/>
           <w:p/>
         </w:tc>
       </w:tr>
@@ -27956,7 +28046,7 @@
       <w:tr>
         <w:tc>
           <w:tcPr/>
-          <w:bookmarkStart w:id="159" w:name="tbl-comp-a2-comb"/>
+          <w:bookmarkStart w:id="161" w:name="tbl-comp-a2-comb"/>
           <w:p>
             <w:pPr>
               <w:jc w:val="center"/>
@@ -28792,7 +28882,7 @@
               </w:tc>
             </w:tr>
           </w:tbl>
-          <w:bookmarkEnd w:id="159"/>
+          <w:bookmarkEnd w:id="161"/>
           <w:p/>
         </w:tc>
       </w:tr>
@@ -28818,7 +28908,7 @@
       <w:tr>
         <w:tc>
           <w:tcPr/>
-          <w:bookmarkStart w:id="160" w:name="tbl-strong-a2-score"/>
+          <w:bookmarkStart w:id="162" w:name="tbl-strong-a2-score"/>
           <w:p>
             <w:pPr>
               <w:jc w:val="center"/>
@@ -29317,7 +29407,7 @@
               </w:tc>
             </w:tr>
           </w:tbl>
-          <w:bookmarkEnd w:id="160"/>
+          <w:bookmarkEnd w:id="162"/>
           <w:p/>
         </w:tc>
       </w:tr>
@@ -29343,7 +29433,7 @@
       <w:tr>
         <w:tc>
           <w:tcPr/>
-          <w:bookmarkStart w:id="161" w:name="tbl-comp-a2-score"/>
+          <w:bookmarkStart w:id="163" w:name="tbl-comp-a2-score"/>
           <w:p>
             <w:pPr>
               <w:jc w:val="center"/>
@@ -29710,13 +29800,13 @@
               </w:tc>
             </w:tr>
           </w:tbl>
-          <w:bookmarkEnd w:id="161"/>
+          <w:bookmarkEnd w:id="163"/>
           <w:p/>
         </w:tc>
       </w:tr>
     </w:tbl>
-    <w:bookmarkStart w:id="164" w:name="refs"/>
-    <w:bookmarkStart w:id="163" w:name="X130cc6218cdcb99520dccce7f8b213552eaa63a"/>
+    <w:bookmarkStart w:id="166" w:name="refs"/>
+    <w:bookmarkStart w:id="165" w:name="X130cc6218cdcb99520dccce7f8b213552eaa63a"/>
     <w:p>
       <w:pPr>
         <w:pStyle w:val="Bibliography"/>
@@ -29730,7 +29820,7 @@
       <w:r>
         <w:t xml:space="preserve">“</w:t>
       </w:r>
-      <w:hyperlink r:id="rId162">
+      <w:hyperlink r:id="rId164">
         <w:r>
           <w:rPr>
             <w:rStyle w:val="Hyperlink"/>
@@ -29758,12 +29848,12 @@
         <w:t xml:space="preserve">33 (1): 159–74.</w:t>
       </w:r>
     </w:p>
-    <w:bookmarkEnd w:id="163"/>
-    <w:bookmarkEnd w:id="164"/>
     <w:bookmarkEnd w:id="165"/>
     <w:bookmarkEnd w:id="166"/>
     <w:bookmarkEnd w:id="167"/>
     <w:bookmarkEnd w:id="168"/>
+    <w:bookmarkEnd w:id="169"/>
+    <w:bookmarkEnd w:id="170"/>
     <w:sectPr>
       <w:footnotePr>
         <w:numRestart w:val="eachSect"/>

</xml_diff>

<commit_message>
Add predictive values to score thresholds
</commit_message>
<xml_diff>
--- a/docs/these_brieuc_last_recueil.docx
+++ b/docs/these_brieuc_last_recueil.docx
@@ -2817,7 +2817,7 @@
               <w:jc w:val="right"/>
             </w:pPr>
             <w:r>
-              <w:t xml:space="preserve">NA’s</w:t>
+              <w:t xml:space="preserve">NAs</w:t>
             </w:r>
           </w:p>
         </w:tc>
@@ -13647,7 +13647,7 @@
         <w:pStyle w:val="FirstParagraph"/>
       </w:pPr>
       <w:r>
-        <w:t xml:space="preserve">L’objectif ici est de calculer les performances diagnostiques (sensibilité, spécificité, LR+, LR-, Youden, DOR) pour différents seuils de score (</w:t>
+        <w:t xml:space="preserve">L’objectif ici est de calculer les performances diagnostiques (sensibilité, spécificité, VPP, VPN, LR+, LR-, Youden, DOR) pour différents seuils de score (</w:t>
       </w:r>
       <w:r>
         <w:rPr>
@@ -13777,7 +13777,7 @@
         <w:pStyle w:val="TableCaption"/>
       </w:pPr>
       <w:r>
-        <w:t xml:space="preserve">Performances diagnostiques selon le seuil du score</w:t>
+        <w:t xml:space="preserve">Performances diagnostiques selon le seuil du score : mesures de classification</w:t>
       </w:r>
     </w:p>
     <w:tbl>
@@ -13786,16 +13786,14 @@
         <w:tblW w:type="pct" w:w="5000"/>
         <w:tblLayout w:type="fixed"/>
         <w:tblLook w:firstRow="1" w:lastRow="0" w:firstColumn="0" w:lastColumn="0" w:noHBand="0" w:noVBand="0" w:val="0020"/>
-        <w:tblCaption w:val="Performances diagnostiques selon le seuil du score"/>
+        <w:tblCaption w:val="Performances diagnostiques selon le seuil du score : mesures de classification"/>
       </w:tblPr>
       <w:tblGrid>
-        <w:gridCol w:w="1026"/>
-        <w:gridCol w:w="1686"/>
-        <w:gridCol w:w="1686"/>
-        <w:gridCol w:w="513"/>
-        <w:gridCol w:w="513"/>
-        <w:gridCol w:w="586"/>
-        <w:gridCol w:w="1906"/>
+        <w:gridCol w:w="1498"/>
+        <w:gridCol w:w="2461"/>
+        <w:gridCol w:w="2461"/>
+        <w:gridCol w:w="749"/>
+        <w:gridCol w:w="749"/>
       </w:tblGrid>
       <w:tr>
         <w:trPr>
@@ -13845,43 +13843,19 @@
               <w:jc w:val="center"/>
             </w:pPr>
             <w:r>
-              <w:t xml:space="preserve">LR+</w:t>
-            </w:r>
-          </w:p>
-        </w:tc>
-        <w:tc>
-          <w:tcPr/>
-          <w:p>
-            <w:pPr>
-              <w:pStyle w:val="Compact"/>
-              <w:jc w:val="center"/>
-            </w:pPr>
-            <w:r>
-              <w:t xml:space="preserve">LR-</w:t>
-            </w:r>
-          </w:p>
-        </w:tc>
-        <w:tc>
-          <w:tcPr/>
-          <w:p>
-            <w:pPr>
-              <w:pStyle w:val="Compact"/>
-              <w:jc w:val="center"/>
-            </w:pPr>
-            <w:r>
-              <w:t xml:space="preserve">Youden</w:t>
-            </w:r>
-          </w:p>
-        </w:tc>
-        <w:tc>
-          <w:tcPr/>
-          <w:p>
-            <w:pPr>
-              <w:pStyle w:val="Compact"/>
-              <w:jc w:val="center"/>
-            </w:pPr>
-            <w:r>
-              <w:t xml:space="preserve">DOR [IC95%]</w:t>
+              <w:t xml:space="preserve">VPP</w:t>
+            </w:r>
+          </w:p>
+        </w:tc>
+        <w:tc>
+          <w:tcPr/>
+          <w:p>
+            <w:pPr>
+              <w:pStyle w:val="Compact"/>
+              <w:jc w:val="center"/>
+            </w:pPr>
+            <w:r>
+              <w:t xml:space="preserve">VPN</w:t>
             </w:r>
           </w:p>
         </w:tc>
@@ -13931,43 +13905,19 @@
               <w:jc w:val="center"/>
             </w:pPr>
             <w:r>
-              <w:t xml:space="preserve">2.070</w:t>
-            </w:r>
-          </w:p>
-        </w:tc>
-        <w:tc>
-          <w:tcPr/>
-          <w:p>
-            <w:pPr>
-              <w:pStyle w:val="Compact"/>
-              <w:jc w:val="center"/>
-            </w:pPr>
-            <w:r>
-              <w:t xml:space="preserve">0.083</w:t>
-            </w:r>
-          </w:p>
-        </w:tc>
-        <w:tc>
-          <w:tcPr/>
-          <w:p>
-            <w:pPr>
-              <w:pStyle w:val="Compact"/>
-              <w:jc w:val="center"/>
-            </w:pPr>
-            <w:r>
-              <w:t xml:space="preserve">0.494</w:t>
-            </w:r>
-          </w:p>
-        </w:tc>
-        <w:tc>
-          <w:tcPr/>
-          <w:p>
-            <w:pPr>
-              <w:pStyle w:val="Compact"/>
-              <w:jc w:val="center"/>
-            </w:pPr>
-            <w:r>
-              <w:t xml:space="preserve">25.083 [4.994 ; 125.974]</w:t>
+              <w:t xml:space="preserve">0.782</w:t>
+            </w:r>
+          </w:p>
+        </w:tc>
+        <w:tc>
+          <w:tcPr/>
+          <w:p>
+            <w:pPr>
+              <w:pStyle w:val="Compact"/>
+              <w:jc w:val="center"/>
+            </w:pPr>
+            <w:r>
+              <w:t xml:space="preserve">0.875</w:t>
             </w:r>
           </w:p>
         </w:tc>
@@ -14017,43 +13967,19 @@
               <w:jc w:val="center"/>
             </w:pPr>
             <w:r>
-              <w:t xml:space="preserve">2.196</w:t>
-            </w:r>
-          </w:p>
-        </w:tc>
-        <w:tc>
-          <w:tcPr/>
-          <w:p>
-            <w:pPr>
-              <w:pStyle w:val="Compact"/>
-              <w:jc w:val="center"/>
-            </w:pPr>
-            <w:r>
-              <w:t xml:space="preserve">0.253</w:t>
-            </w:r>
-          </w:p>
-        </w:tc>
-        <w:tc>
-          <w:tcPr/>
-          <w:p>
-            <w:pPr>
-              <w:pStyle w:val="Compact"/>
-              <w:jc w:val="center"/>
-            </w:pPr>
-            <w:r>
-              <w:t xml:space="preserve">0.460</w:t>
-            </w:r>
-          </w:p>
-        </w:tc>
-        <w:tc>
-          <w:tcPr/>
-          <w:p>
-            <w:pPr>
-              <w:pStyle w:val="Compact"/>
-              <w:jc w:val="center"/>
-            </w:pPr>
-            <w:r>
-              <w:t xml:space="preserve">8.686 [2.809 ; 26.855]</w:t>
+              <w:t xml:space="preserve">0.792</w:t>
+            </w:r>
+          </w:p>
+        </w:tc>
+        <w:tc>
+          <w:tcPr/>
+          <w:p>
+            <w:pPr>
+              <w:pStyle w:val="Compact"/>
+              <w:jc w:val="center"/>
+            </w:pPr>
+            <w:r>
+              <w:t xml:space="preserve">0.696</w:t>
             </w:r>
           </w:p>
         </w:tc>
@@ -14103,43 +14029,19 @@
               <w:jc w:val="center"/>
             </w:pPr>
             <w:r>
-              <w:t xml:space="preserve">1.862</w:t>
-            </w:r>
-          </w:p>
-        </w:tc>
-        <w:tc>
-          <w:tcPr/>
-          <w:p>
-            <w:pPr>
-              <w:pStyle w:val="Compact"/>
-              <w:jc w:val="center"/>
-            </w:pPr>
-            <w:r>
-              <w:t xml:space="preserve">0.544</w:t>
-            </w:r>
-          </w:p>
-        </w:tc>
-        <w:tc>
-          <w:tcPr/>
-          <w:p>
-            <w:pPr>
-              <w:pStyle w:val="Compact"/>
-              <w:jc w:val="center"/>
-            </w:pPr>
-            <w:r>
-              <w:t xml:space="preserve">0.298</w:t>
-            </w:r>
-          </w:p>
-        </w:tc>
-        <w:tc>
-          <w:tcPr/>
-          <w:p>
-            <w:pPr>
-              <w:pStyle w:val="Compact"/>
-              <w:jc w:val="center"/>
-            </w:pPr>
-            <w:r>
-              <w:t xml:space="preserve">3.424 [1.244 ; 9.424]</w:t>
+              <w:t xml:space="preserve">0.763</w:t>
+            </w:r>
+          </w:p>
+        </w:tc>
+        <w:tc>
+          <w:tcPr/>
+          <w:p>
+            <w:pPr>
+              <w:pStyle w:val="Compact"/>
+              <w:jc w:val="center"/>
+            </w:pPr>
+            <w:r>
+              <w:t xml:space="preserve">0.515</w:t>
             </w:r>
           </w:p>
         </w:tc>
@@ -14178,6 +14080,326 @@
             </w:pPr>
             <w:r>
               <w:t xml:space="preserve">0.769 [0.564 ; 0.91]</w:t>
+            </w:r>
+          </w:p>
+        </w:tc>
+        <w:tc>
+          <w:tcPr/>
+          <w:p>
+            <w:pPr>
+              <w:pStyle w:val="Compact"/>
+              <w:jc w:val="center"/>
+            </w:pPr>
+            <w:r>
+              <w:t xml:space="preserve">0.647</w:t>
+            </w:r>
+          </w:p>
+        </w:tc>
+        <w:tc>
+          <w:tcPr/>
+          <w:p>
+            <w:pPr>
+              <w:pStyle w:val="Compact"/>
+              <w:jc w:val="center"/>
+            </w:pPr>
+            <w:r>
+              <w:t xml:space="preserve">0.370</w:t>
+            </w:r>
+          </w:p>
+        </w:tc>
+      </w:tr>
+    </w:tbl>
+    <w:p>
+      <w:pPr>
+        <w:pStyle w:val="BodyText"/>
+      </w:pPr>
+      <w:r>
+        <w:t xml:space="preserve"> </w:t>
+      </w:r>
+    </w:p>
+    <w:p>
+      <w:pPr>
+        <w:pStyle w:val="TableCaption"/>
+      </w:pPr>
+      <w:r>
+        <w:t xml:space="preserve">Performances diagnostiques selon le seuil du score : rapports et indices</w:t>
+      </w:r>
+    </w:p>
+    <w:tbl>
+      <w:tblPr>
+        <w:tblStyle w:val="Table"/>
+        <w:tblW w:type="auto" w:w="0"/>
+        <w:tblLook w:firstRow="1" w:lastRow="0" w:firstColumn="0" w:lastColumn="0" w:noHBand="0" w:noVBand="0" w:val="0020"/>
+        <w:tblCaption w:val="Performances diagnostiques selon le seuil du score : rapports et indices"/>
+      </w:tblPr>
+      <w:tblGrid>
+        <w:gridCol w:w="1584"/>
+        <w:gridCol w:w="1584"/>
+        <w:gridCol w:w="1584"/>
+        <w:gridCol w:w="1584"/>
+        <w:gridCol w:w="1584"/>
+      </w:tblGrid>
+      <w:tr>
+        <w:trPr>
+          <w:tblHeader w:val="on"/>
+        </w:trPr>
+        <w:tc>
+          <w:tcPr/>
+          <w:p>
+            <w:pPr>
+              <w:pStyle w:val="Compact"/>
+              <w:jc w:val="center"/>
+            </w:pPr>
+            <w:r>
+              <w:t xml:space="preserve">Seuil</w:t>
+            </w:r>
+          </w:p>
+        </w:tc>
+        <w:tc>
+          <w:tcPr/>
+          <w:p>
+            <w:pPr>
+              <w:pStyle w:val="Compact"/>
+              <w:jc w:val="center"/>
+            </w:pPr>
+            <w:r>
+              <w:t xml:space="preserve">LR+</w:t>
+            </w:r>
+          </w:p>
+        </w:tc>
+        <w:tc>
+          <w:tcPr/>
+          <w:p>
+            <w:pPr>
+              <w:pStyle w:val="Compact"/>
+              <w:jc w:val="center"/>
+            </w:pPr>
+            <w:r>
+              <w:t xml:space="preserve">LR-</w:t>
+            </w:r>
+          </w:p>
+        </w:tc>
+        <w:tc>
+          <w:tcPr/>
+          <w:p>
+            <w:pPr>
+              <w:pStyle w:val="Compact"/>
+              <w:jc w:val="center"/>
+            </w:pPr>
+            <w:r>
+              <w:t xml:space="preserve">Youden</w:t>
+            </w:r>
+          </w:p>
+        </w:tc>
+        <w:tc>
+          <w:tcPr/>
+          <w:p>
+            <w:pPr>
+              <w:pStyle w:val="Compact"/>
+              <w:jc w:val="center"/>
+            </w:pPr>
+            <w:r>
+              <w:t xml:space="preserve">DOR [IC95%]</w:t>
+            </w:r>
+          </w:p>
+        </w:tc>
+      </w:tr>
+      <w:tr>
+        <w:tc>
+          <w:tcPr/>
+          <w:p>
+            <w:pPr>
+              <w:pStyle w:val="Compact"/>
+              <w:jc w:val="center"/>
+            </w:pPr>
+            <w:r>
+              <w:t xml:space="preserve">&gt;=1 positif</w:t>
+            </w:r>
+          </w:p>
+        </w:tc>
+        <w:tc>
+          <w:tcPr/>
+          <w:p>
+            <w:pPr>
+              <w:pStyle w:val="Compact"/>
+              <w:jc w:val="center"/>
+            </w:pPr>
+            <w:r>
+              <w:t xml:space="preserve">2.070</w:t>
+            </w:r>
+          </w:p>
+        </w:tc>
+        <w:tc>
+          <w:tcPr/>
+          <w:p>
+            <w:pPr>
+              <w:pStyle w:val="Compact"/>
+              <w:jc w:val="center"/>
+            </w:pPr>
+            <w:r>
+              <w:t xml:space="preserve">0.083</w:t>
+            </w:r>
+          </w:p>
+        </w:tc>
+        <w:tc>
+          <w:tcPr/>
+          <w:p>
+            <w:pPr>
+              <w:pStyle w:val="Compact"/>
+              <w:jc w:val="center"/>
+            </w:pPr>
+            <w:r>
+              <w:t xml:space="preserve">0.494</w:t>
+            </w:r>
+          </w:p>
+        </w:tc>
+        <w:tc>
+          <w:tcPr/>
+          <w:p>
+            <w:pPr>
+              <w:pStyle w:val="Compact"/>
+              <w:jc w:val="center"/>
+            </w:pPr>
+            <w:r>
+              <w:t xml:space="preserve">25.083 [4.994 ; 125.974]</w:t>
+            </w:r>
+          </w:p>
+        </w:tc>
+      </w:tr>
+      <w:tr>
+        <w:tc>
+          <w:tcPr/>
+          <w:p>
+            <w:pPr>
+              <w:pStyle w:val="Compact"/>
+              <w:jc w:val="center"/>
+            </w:pPr>
+            <w:r>
+              <w:t xml:space="preserve">&gt;=2 positifs</w:t>
+            </w:r>
+          </w:p>
+        </w:tc>
+        <w:tc>
+          <w:tcPr/>
+          <w:p>
+            <w:pPr>
+              <w:pStyle w:val="Compact"/>
+              <w:jc w:val="center"/>
+            </w:pPr>
+            <w:r>
+              <w:t xml:space="preserve">2.196</w:t>
+            </w:r>
+          </w:p>
+        </w:tc>
+        <w:tc>
+          <w:tcPr/>
+          <w:p>
+            <w:pPr>
+              <w:pStyle w:val="Compact"/>
+              <w:jc w:val="center"/>
+            </w:pPr>
+            <w:r>
+              <w:t xml:space="preserve">0.253</w:t>
+            </w:r>
+          </w:p>
+        </w:tc>
+        <w:tc>
+          <w:tcPr/>
+          <w:p>
+            <w:pPr>
+              <w:pStyle w:val="Compact"/>
+              <w:jc w:val="center"/>
+            </w:pPr>
+            <w:r>
+              <w:t xml:space="preserve">0.460</w:t>
+            </w:r>
+          </w:p>
+        </w:tc>
+        <w:tc>
+          <w:tcPr/>
+          <w:p>
+            <w:pPr>
+              <w:pStyle w:val="Compact"/>
+              <w:jc w:val="center"/>
+            </w:pPr>
+            <w:r>
+              <w:t xml:space="preserve">8.686 [2.809 ; 26.855]</w:t>
+            </w:r>
+          </w:p>
+        </w:tc>
+      </w:tr>
+      <w:tr>
+        <w:tc>
+          <w:tcPr/>
+          <w:p>
+            <w:pPr>
+              <w:pStyle w:val="Compact"/>
+              <w:jc w:val="center"/>
+            </w:pPr>
+            <w:r>
+              <w:t xml:space="preserve">&gt;=3 positifs</w:t>
+            </w:r>
+          </w:p>
+        </w:tc>
+        <w:tc>
+          <w:tcPr/>
+          <w:p>
+            <w:pPr>
+              <w:pStyle w:val="Compact"/>
+              <w:jc w:val="center"/>
+            </w:pPr>
+            <w:r>
+              <w:t xml:space="preserve">1.862</w:t>
+            </w:r>
+          </w:p>
+        </w:tc>
+        <w:tc>
+          <w:tcPr/>
+          <w:p>
+            <w:pPr>
+              <w:pStyle w:val="Compact"/>
+              <w:jc w:val="center"/>
+            </w:pPr>
+            <w:r>
+              <w:t xml:space="preserve">0.544</w:t>
+            </w:r>
+          </w:p>
+        </w:tc>
+        <w:tc>
+          <w:tcPr/>
+          <w:p>
+            <w:pPr>
+              <w:pStyle w:val="Compact"/>
+              <w:jc w:val="center"/>
+            </w:pPr>
+            <w:r>
+              <w:t xml:space="preserve">0.298</w:t>
+            </w:r>
+          </w:p>
+        </w:tc>
+        <w:tc>
+          <w:tcPr/>
+          <w:p>
+            <w:pPr>
+              <w:pStyle w:val="Compact"/>
+              <w:jc w:val="center"/>
+            </w:pPr>
+            <w:r>
+              <w:t xml:space="preserve">3.424 [1.244 ; 9.424]</w:t>
+            </w:r>
+          </w:p>
+        </w:tc>
+      </w:tr>
+      <w:tr>
+        <w:tc>
+          <w:tcPr/>
+          <w:p>
+            <w:pPr>
+              <w:pStyle w:val="Compact"/>
+              <w:jc w:val="center"/>
+            </w:pPr>
+            <w:r>
+              <w:t xml:space="preserve">&gt;=4 positifs</w:t>
             </w:r>
           </w:p>
         </w:tc>
@@ -14335,6 +14557,91 @@
           <w:iCs/>
         </w:rPr>
         <w:t xml:space="preserve">(se calcule en faisant le rapport entre le LR+ et le LR-), mais il reste ici secondaire car moins intuitif cliniquement que la sensibilité, la spécificité et les rapports de vraisemblance. En plus, les IC du DOR sont ici très larges et se chevauchent largement, donc ils ne sont pas vraiment interprétables.</w:t>
+      </w:r>
+    </w:p>
+    <w:p>
+      <w:pPr>
+        <w:pStyle w:val="BodyText"/>
+      </w:pPr>
+      <w:r>
+        <w:t xml:space="preserve">Les</w:t>
+      </w:r>
+      <w:r>
+        <w:t xml:space="preserve"> </w:t>
+      </w:r>
+      <w:r>
+        <w:rPr>
+          <w:b/>
+          <w:bCs/>
+        </w:rPr>
+        <w:t xml:space="preserve">VPP</w:t>
+      </w:r>
+      <w:r>
+        <w:t xml:space="preserve"> </w:t>
+      </w:r>
+      <w:r>
+        <w:t xml:space="preserve">et</w:t>
+      </w:r>
+      <w:r>
+        <w:t xml:space="preserve"> </w:t>
+      </w:r>
+      <w:r>
+        <w:rPr>
+          <w:b/>
+          <w:bCs/>
+        </w:rPr>
+        <w:t xml:space="preserve">VPN</w:t>
+      </w:r>
+      <w:r>
+        <w:t xml:space="preserve"> </w:t>
+      </w:r>
+      <w:r>
+        <w:t xml:space="preserve">correspondent ici aux probabilités observées d’être respectivement</w:t>
+      </w:r>
+      <w:r>
+        <w:t xml:space="preserve"> </w:t>
+      </w:r>
+      <w:r>
+        <w:rPr>
+          <w:rStyle w:val="VerbatimChar"/>
+        </w:rPr>
+        <w:t xml:space="preserve">G+</w:t>
+      </w:r>
+      <w:r>
+        <w:t xml:space="preserve"> </w:t>
+      </w:r>
+      <w:r>
+        <w:t xml:space="preserve">après un score positif et</w:t>
+      </w:r>
+      <w:r>
+        <w:t xml:space="preserve"> </w:t>
+      </w:r>
+      <w:r>
+        <w:rPr>
+          <w:rStyle w:val="VerbatimChar"/>
+        </w:rPr>
+        <w:t xml:space="preserve">G-</w:t>
+      </w:r>
+      <w:r>
+        <w:t xml:space="preserve"> </w:t>
+      </w:r>
+      <w:r>
+        <w:t xml:space="preserve">après un score négatif. Contrairement à la sensibilité et à la spécificité, elles dépendent de la prévalence de</w:t>
+      </w:r>
+      <w:r>
+        <w:t xml:space="preserve"> </w:t>
+      </w:r>
+      <w:r>
+        <w:rPr>
+          <w:rStyle w:val="VerbatimChar"/>
+        </w:rPr>
+        <w:t xml:space="preserve">G+</w:t>
+      </w:r>
+      <w:r>
+        <w:t xml:space="preserve"> </w:t>
+      </w:r>
+      <w:r>
+        <w:t xml:space="preserve">dans cet échantillon et ne sont donc pas directement transposables à une population ayant une prévalence différente.</w:t>
       </w:r>
     </w:p>
     <w:p>

</xml_diff>

<commit_message>
Ajouter VPP et VPN au score de positivité (#7)
Calcule et affiche les valeurs prédictives pour chaque seuil, adapte le rendu Word et régénère les trois formats.
</commit_message>
<xml_diff>
--- a/docs/these_brieuc_last_recueil.docx
+++ b/docs/these_brieuc_last_recueil.docx
@@ -2817,7 +2817,7 @@
               <w:jc w:val="right"/>
             </w:pPr>
             <w:r>
-              <w:t xml:space="preserve">NA’s</w:t>
+              <w:t xml:space="preserve">NAs</w:t>
             </w:r>
           </w:p>
         </w:tc>
@@ -13647,7 +13647,7 @@
         <w:pStyle w:val="FirstParagraph"/>
       </w:pPr>
       <w:r>
-        <w:t xml:space="preserve">L’objectif ici est de calculer les performances diagnostiques (sensibilité, spécificité, LR+, LR-, Youden, DOR) pour différents seuils de score (</w:t>
+        <w:t xml:space="preserve">L’objectif ici est de calculer les performances diagnostiques (sensibilité, spécificité, VPP, VPN, LR+, LR-, Youden, DOR) pour différents seuils de score (</w:t>
       </w:r>
       <w:r>
         <w:rPr>
@@ -13777,7 +13777,7 @@
         <w:pStyle w:val="TableCaption"/>
       </w:pPr>
       <w:r>
-        <w:t xml:space="preserve">Performances diagnostiques selon le seuil du score</w:t>
+        <w:t xml:space="preserve">Performances diagnostiques selon le seuil du score : mesures de classification</w:t>
       </w:r>
     </w:p>
     <w:tbl>
@@ -13786,16 +13786,14 @@
         <w:tblW w:type="pct" w:w="5000"/>
         <w:tblLayout w:type="fixed"/>
         <w:tblLook w:firstRow="1" w:lastRow="0" w:firstColumn="0" w:lastColumn="0" w:noHBand="0" w:noVBand="0" w:val="0020"/>
-        <w:tblCaption w:val="Performances diagnostiques selon le seuil du score"/>
+        <w:tblCaption w:val="Performances diagnostiques selon le seuil du score : mesures de classification"/>
       </w:tblPr>
       <w:tblGrid>
-        <w:gridCol w:w="1026"/>
-        <w:gridCol w:w="1686"/>
-        <w:gridCol w:w="1686"/>
-        <w:gridCol w:w="513"/>
-        <w:gridCol w:w="513"/>
-        <w:gridCol w:w="586"/>
-        <w:gridCol w:w="1906"/>
+        <w:gridCol w:w="1498"/>
+        <w:gridCol w:w="2461"/>
+        <w:gridCol w:w="2461"/>
+        <w:gridCol w:w="749"/>
+        <w:gridCol w:w="749"/>
       </w:tblGrid>
       <w:tr>
         <w:trPr>
@@ -13845,43 +13843,19 @@
               <w:jc w:val="center"/>
             </w:pPr>
             <w:r>
-              <w:t xml:space="preserve">LR+</w:t>
-            </w:r>
-          </w:p>
-        </w:tc>
-        <w:tc>
-          <w:tcPr/>
-          <w:p>
-            <w:pPr>
-              <w:pStyle w:val="Compact"/>
-              <w:jc w:val="center"/>
-            </w:pPr>
-            <w:r>
-              <w:t xml:space="preserve">LR-</w:t>
-            </w:r>
-          </w:p>
-        </w:tc>
-        <w:tc>
-          <w:tcPr/>
-          <w:p>
-            <w:pPr>
-              <w:pStyle w:val="Compact"/>
-              <w:jc w:val="center"/>
-            </w:pPr>
-            <w:r>
-              <w:t xml:space="preserve">Youden</w:t>
-            </w:r>
-          </w:p>
-        </w:tc>
-        <w:tc>
-          <w:tcPr/>
-          <w:p>
-            <w:pPr>
-              <w:pStyle w:val="Compact"/>
-              <w:jc w:val="center"/>
-            </w:pPr>
-            <w:r>
-              <w:t xml:space="preserve">DOR [IC95%]</w:t>
+              <w:t xml:space="preserve">VPP</w:t>
+            </w:r>
+          </w:p>
+        </w:tc>
+        <w:tc>
+          <w:tcPr/>
+          <w:p>
+            <w:pPr>
+              <w:pStyle w:val="Compact"/>
+              <w:jc w:val="center"/>
+            </w:pPr>
+            <w:r>
+              <w:t xml:space="preserve">VPN</w:t>
             </w:r>
           </w:p>
         </w:tc>
@@ -13931,43 +13905,19 @@
               <w:jc w:val="center"/>
             </w:pPr>
             <w:r>
-              <w:t xml:space="preserve">2.070</w:t>
-            </w:r>
-          </w:p>
-        </w:tc>
-        <w:tc>
-          <w:tcPr/>
-          <w:p>
-            <w:pPr>
-              <w:pStyle w:val="Compact"/>
-              <w:jc w:val="center"/>
-            </w:pPr>
-            <w:r>
-              <w:t xml:space="preserve">0.083</w:t>
-            </w:r>
-          </w:p>
-        </w:tc>
-        <w:tc>
-          <w:tcPr/>
-          <w:p>
-            <w:pPr>
-              <w:pStyle w:val="Compact"/>
-              <w:jc w:val="center"/>
-            </w:pPr>
-            <w:r>
-              <w:t xml:space="preserve">0.494</w:t>
-            </w:r>
-          </w:p>
-        </w:tc>
-        <w:tc>
-          <w:tcPr/>
-          <w:p>
-            <w:pPr>
-              <w:pStyle w:val="Compact"/>
-              <w:jc w:val="center"/>
-            </w:pPr>
-            <w:r>
-              <w:t xml:space="preserve">25.083 [4.994 ; 125.974]</w:t>
+              <w:t xml:space="preserve">0.782</w:t>
+            </w:r>
+          </w:p>
+        </w:tc>
+        <w:tc>
+          <w:tcPr/>
+          <w:p>
+            <w:pPr>
+              <w:pStyle w:val="Compact"/>
+              <w:jc w:val="center"/>
+            </w:pPr>
+            <w:r>
+              <w:t xml:space="preserve">0.875</w:t>
             </w:r>
           </w:p>
         </w:tc>
@@ -14017,43 +13967,19 @@
               <w:jc w:val="center"/>
             </w:pPr>
             <w:r>
-              <w:t xml:space="preserve">2.196</w:t>
-            </w:r>
-          </w:p>
-        </w:tc>
-        <w:tc>
-          <w:tcPr/>
-          <w:p>
-            <w:pPr>
-              <w:pStyle w:val="Compact"/>
-              <w:jc w:val="center"/>
-            </w:pPr>
-            <w:r>
-              <w:t xml:space="preserve">0.253</w:t>
-            </w:r>
-          </w:p>
-        </w:tc>
-        <w:tc>
-          <w:tcPr/>
-          <w:p>
-            <w:pPr>
-              <w:pStyle w:val="Compact"/>
-              <w:jc w:val="center"/>
-            </w:pPr>
-            <w:r>
-              <w:t xml:space="preserve">0.460</w:t>
-            </w:r>
-          </w:p>
-        </w:tc>
-        <w:tc>
-          <w:tcPr/>
-          <w:p>
-            <w:pPr>
-              <w:pStyle w:val="Compact"/>
-              <w:jc w:val="center"/>
-            </w:pPr>
-            <w:r>
-              <w:t xml:space="preserve">8.686 [2.809 ; 26.855]</w:t>
+              <w:t xml:space="preserve">0.792</w:t>
+            </w:r>
+          </w:p>
+        </w:tc>
+        <w:tc>
+          <w:tcPr/>
+          <w:p>
+            <w:pPr>
+              <w:pStyle w:val="Compact"/>
+              <w:jc w:val="center"/>
+            </w:pPr>
+            <w:r>
+              <w:t xml:space="preserve">0.696</w:t>
             </w:r>
           </w:p>
         </w:tc>
@@ -14103,43 +14029,19 @@
               <w:jc w:val="center"/>
             </w:pPr>
             <w:r>
-              <w:t xml:space="preserve">1.862</w:t>
-            </w:r>
-          </w:p>
-        </w:tc>
-        <w:tc>
-          <w:tcPr/>
-          <w:p>
-            <w:pPr>
-              <w:pStyle w:val="Compact"/>
-              <w:jc w:val="center"/>
-            </w:pPr>
-            <w:r>
-              <w:t xml:space="preserve">0.544</w:t>
-            </w:r>
-          </w:p>
-        </w:tc>
-        <w:tc>
-          <w:tcPr/>
-          <w:p>
-            <w:pPr>
-              <w:pStyle w:val="Compact"/>
-              <w:jc w:val="center"/>
-            </w:pPr>
-            <w:r>
-              <w:t xml:space="preserve">0.298</w:t>
-            </w:r>
-          </w:p>
-        </w:tc>
-        <w:tc>
-          <w:tcPr/>
-          <w:p>
-            <w:pPr>
-              <w:pStyle w:val="Compact"/>
-              <w:jc w:val="center"/>
-            </w:pPr>
-            <w:r>
-              <w:t xml:space="preserve">3.424 [1.244 ; 9.424]</w:t>
+              <w:t xml:space="preserve">0.763</w:t>
+            </w:r>
+          </w:p>
+        </w:tc>
+        <w:tc>
+          <w:tcPr/>
+          <w:p>
+            <w:pPr>
+              <w:pStyle w:val="Compact"/>
+              <w:jc w:val="center"/>
+            </w:pPr>
+            <w:r>
+              <w:t xml:space="preserve">0.515</w:t>
             </w:r>
           </w:p>
         </w:tc>
@@ -14178,6 +14080,326 @@
             </w:pPr>
             <w:r>
               <w:t xml:space="preserve">0.769 [0.564 ; 0.91]</w:t>
+            </w:r>
+          </w:p>
+        </w:tc>
+        <w:tc>
+          <w:tcPr/>
+          <w:p>
+            <w:pPr>
+              <w:pStyle w:val="Compact"/>
+              <w:jc w:val="center"/>
+            </w:pPr>
+            <w:r>
+              <w:t xml:space="preserve">0.647</w:t>
+            </w:r>
+          </w:p>
+        </w:tc>
+        <w:tc>
+          <w:tcPr/>
+          <w:p>
+            <w:pPr>
+              <w:pStyle w:val="Compact"/>
+              <w:jc w:val="center"/>
+            </w:pPr>
+            <w:r>
+              <w:t xml:space="preserve">0.370</w:t>
+            </w:r>
+          </w:p>
+        </w:tc>
+      </w:tr>
+    </w:tbl>
+    <w:p>
+      <w:pPr>
+        <w:pStyle w:val="BodyText"/>
+      </w:pPr>
+      <w:r>
+        <w:t xml:space="preserve"> </w:t>
+      </w:r>
+    </w:p>
+    <w:p>
+      <w:pPr>
+        <w:pStyle w:val="TableCaption"/>
+      </w:pPr>
+      <w:r>
+        <w:t xml:space="preserve">Performances diagnostiques selon le seuil du score : rapports et indices</w:t>
+      </w:r>
+    </w:p>
+    <w:tbl>
+      <w:tblPr>
+        <w:tblStyle w:val="Table"/>
+        <w:tblW w:type="auto" w:w="0"/>
+        <w:tblLook w:firstRow="1" w:lastRow="0" w:firstColumn="0" w:lastColumn="0" w:noHBand="0" w:noVBand="0" w:val="0020"/>
+        <w:tblCaption w:val="Performances diagnostiques selon le seuil du score : rapports et indices"/>
+      </w:tblPr>
+      <w:tblGrid>
+        <w:gridCol w:w="1584"/>
+        <w:gridCol w:w="1584"/>
+        <w:gridCol w:w="1584"/>
+        <w:gridCol w:w="1584"/>
+        <w:gridCol w:w="1584"/>
+      </w:tblGrid>
+      <w:tr>
+        <w:trPr>
+          <w:tblHeader w:val="on"/>
+        </w:trPr>
+        <w:tc>
+          <w:tcPr/>
+          <w:p>
+            <w:pPr>
+              <w:pStyle w:val="Compact"/>
+              <w:jc w:val="center"/>
+            </w:pPr>
+            <w:r>
+              <w:t xml:space="preserve">Seuil</w:t>
+            </w:r>
+          </w:p>
+        </w:tc>
+        <w:tc>
+          <w:tcPr/>
+          <w:p>
+            <w:pPr>
+              <w:pStyle w:val="Compact"/>
+              <w:jc w:val="center"/>
+            </w:pPr>
+            <w:r>
+              <w:t xml:space="preserve">LR+</w:t>
+            </w:r>
+          </w:p>
+        </w:tc>
+        <w:tc>
+          <w:tcPr/>
+          <w:p>
+            <w:pPr>
+              <w:pStyle w:val="Compact"/>
+              <w:jc w:val="center"/>
+            </w:pPr>
+            <w:r>
+              <w:t xml:space="preserve">LR-</w:t>
+            </w:r>
+          </w:p>
+        </w:tc>
+        <w:tc>
+          <w:tcPr/>
+          <w:p>
+            <w:pPr>
+              <w:pStyle w:val="Compact"/>
+              <w:jc w:val="center"/>
+            </w:pPr>
+            <w:r>
+              <w:t xml:space="preserve">Youden</w:t>
+            </w:r>
+          </w:p>
+        </w:tc>
+        <w:tc>
+          <w:tcPr/>
+          <w:p>
+            <w:pPr>
+              <w:pStyle w:val="Compact"/>
+              <w:jc w:val="center"/>
+            </w:pPr>
+            <w:r>
+              <w:t xml:space="preserve">DOR [IC95%]</w:t>
+            </w:r>
+          </w:p>
+        </w:tc>
+      </w:tr>
+      <w:tr>
+        <w:tc>
+          <w:tcPr/>
+          <w:p>
+            <w:pPr>
+              <w:pStyle w:val="Compact"/>
+              <w:jc w:val="center"/>
+            </w:pPr>
+            <w:r>
+              <w:t xml:space="preserve">&gt;=1 positif</w:t>
+            </w:r>
+          </w:p>
+        </w:tc>
+        <w:tc>
+          <w:tcPr/>
+          <w:p>
+            <w:pPr>
+              <w:pStyle w:val="Compact"/>
+              <w:jc w:val="center"/>
+            </w:pPr>
+            <w:r>
+              <w:t xml:space="preserve">2.070</w:t>
+            </w:r>
+          </w:p>
+        </w:tc>
+        <w:tc>
+          <w:tcPr/>
+          <w:p>
+            <w:pPr>
+              <w:pStyle w:val="Compact"/>
+              <w:jc w:val="center"/>
+            </w:pPr>
+            <w:r>
+              <w:t xml:space="preserve">0.083</w:t>
+            </w:r>
+          </w:p>
+        </w:tc>
+        <w:tc>
+          <w:tcPr/>
+          <w:p>
+            <w:pPr>
+              <w:pStyle w:val="Compact"/>
+              <w:jc w:val="center"/>
+            </w:pPr>
+            <w:r>
+              <w:t xml:space="preserve">0.494</w:t>
+            </w:r>
+          </w:p>
+        </w:tc>
+        <w:tc>
+          <w:tcPr/>
+          <w:p>
+            <w:pPr>
+              <w:pStyle w:val="Compact"/>
+              <w:jc w:val="center"/>
+            </w:pPr>
+            <w:r>
+              <w:t xml:space="preserve">25.083 [4.994 ; 125.974]</w:t>
+            </w:r>
+          </w:p>
+        </w:tc>
+      </w:tr>
+      <w:tr>
+        <w:tc>
+          <w:tcPr/>
+          <w:p>
+            <w:pPr>
+              <w:pStyle w:val="Compact"/>
+              <w:jc w:val="center"/>
+            </w:pPr>
+            <w:r>
+              <w:t xml:space="preserve">&gt;=2 positifs</w:t>
+            </w:r>
+          </w:p>
+        </w:tc>
+        <w:tc>
+          <w:tcPr/>
+          <w:p>
+            <w:pPr>
+              <w:pStyle w:val="Compact"/>
+              <w:jc w:val="center"/>
+            </w:pPr>
+            <w:r>
+              <w:t xml:space="preserve">2.196</w:t>
+            </w:r>
+          </w:p>
+        </w:tc>
+        <w:tc>
+          <w:tcPr/>
+          <w:p>
+            <w:pPr>
+              <w:pStyle w:val="Compact"/>
+              <w:jc w:val="center"/>
+            </w:pPr>
+            <w:r>
+              <w:t xml:space="preserve">0.253</w:t>
+            </w:r>
+          </w:p>
+        </w:tc>
+        <w:tc>
+          <w:tcPr/>
+          <w:p>
+            <w:pPr>
+              <w:pStyle w:val="Compact"/>
+              <w:jc w:val="center"/>
+            </w:pPr>
+            <w:r>
+              <w:t xml:space="preserve">0.460</w:t>
+            </w:r>
+          </w:p>
+        </w:tc>
+        <w:tc>
+          <w:tcPr/>
+          <w:p>
+            <w:pPr>
+              <w:pStyle w:val="Compact"/>
+              <w:jc w:val="center"/>
+            </w:pPr>
+            <w:r>
+              <w:t xml:space="preserve">8.686 [2.809 ; 26.855]</w:t>
+            </w:r>
+          </w:p>
+        </w:tc>
+      </w:tr>
+      <w:tr>
+        <w:tc>
+          <w:tcPr/>
+          <w:p>
+            <w:pPr>
+              <w:pStyle w:val="Compact"/>
+              <w:jc w:val="center"/>
+            </w:pPr>
+            <w:r>
+              <w:t xml:space="preserve">&gt;=3 positifs</w:t>
+            </w:r>
+          </w:p>
+        </w:tc>
+        <w:tc>
+          <w:tcPr/>
+          <w:p>
+            <w:pPr>
+              <w:pStyle w:val="Compact"/>
+              <w:jc w:val="center"/>
+            </w:pPr>
+            <w:r>
+              <w:t xml:space="preserve">1.862</w:t>
+            </w:r>
+          </w:p>
+        </w:tc>
+        <w:tc>
+          <w:tcPr/>
+          <w:p>
+            <w:pPr>
+              <w:pStyle w:val="Compact"/>
+              <w:jc w:val="center"/>
+            </w:pPr>
+            <w:r>
+              <w:t xml:space="preserve">0.544</w:t>
+            </w:r>
+          </w:p>
+        </w:tc>
+        <w:tc>
+          <w:tcPr/>
+          <w:p>
+            <w:pPr>
+              <w:pStyle w:val="Compact"/>
+              <w:jc w:val="center"/>
+            </w:pPr>
+            <w:r>
+              <w:t xml:space="preserve">0.298</w:t>
+            </w:r>
+          </w:p>
+        </w:tc>
+        <w:tc>
+          <w:tcPr/>
+          <w:p>
+            <w:pPr>
+              <w:pStyle w:val="Compact"/>
+              <w:jc w:val="center"/>
+            </w:pPr>
+            <w:r>
+              <w:t xml:space="preserve">3.424 [1.244 ; 9.424]</w:t>
+            </w:r>
+          </w:p>
+        </w:tc>
+      </w:tr>
+      <w:tr>
+        <w:tc>
+          <w:tcPr/>
+          <w:p>
+            <w:pPr>
+              <w:pStyle w:val="Compact"/>
+              <w:jc w:val="center"/>
+            </w:pPr>
+            <w:r>
+              <w:t xml:space="preserve">&gt;=4 positifs</w:t>
             </w:r>
           </w:p>
         </w:tc>
@@ -14335,6 +14557,91 @@
           <w:iCs/>
         </w:rPr>
         <w:t xml:space="preserve">(se calcule en faisant le rapport entre le LR+ et le LR-), mais il reste ici secondaire car moins intuitif cliniquement que la sensibilité, la spécificité et les rapports de vraisemblance. En plus, les IC du DOR sont ici très larges et se chevauchent largement, donc ils ne sont pas vraiment interprétables.</w:t>
+      </w:r>
+    </w:p>
+    <w:p>
+      <w:pPr>
+        <w:pStyle w:val="BodyText"/>
+      </w:pPr>
+      <w:r>
+        <w:t xml:space="preserve">Les</w:t>
+      </w:r>
+      <w:r>
+        <w:t xml:space="preserve"> </w:t>
+      </w:r>
+      <w:r>
+        <w:rPr>
+          <w:b/>
+          <w:bCs/>
+        </w:rPr>
+        <w:t xml:space="preserve">VPP</w:t>
+      </w:r>
+      <w:r>
+        <w:t xml:space="preserve"> </w:t>
+      </w:r>
+      <w:r>
+        <w:t xml:space="preserve">et</w:t>
+      </w:r>
+      <w:r>
+        <w:t xml:space="preserve"> </w:t>
+      </w:r>
+      <w:r>
+        <w:rPr>
+          <w:b/>
+          <w:bCs/>
+        </w:rPr>
+        <w:t xml:space="preserve">VPN</w:t>
+      </w:r>
+      <w:r>
+        <w:t xml:space="preserve"> </w:t>
+      </w:r>
+      <w:r>
+        <w:t xml:space="preserve">correspondent ici aux probabilités observées d’être respectivement</w:t>
+      </w:r>
+      <w:r>
+        <w:t xml:space="preserve"> </w:t>
+      </w:r>
+      <w:r>
+        <w:rPr>
+          <w:rStyle w:val="VerbatimChar"/>
+        </w:rPr>
+        <w:t xml:space="preserve">G+</w:t>
+      </w:r>
+      <w:r>
+        <w:t xml:space="preserve"> </w:t>
+      </w:r>
+      <w:r>
+        <w:t xml:space="preserve">après un score positif et</w:t>
+      </w:r>
+      <w:r>
+        <w:t xml:space="preserve"> </w:t>
+      </w:r>
+      <w:r>
+        <w:rPr>
+          <w:rStyle w:val="VerbatimChar"/>
+        </w:rPr>
+        <w:t xml:space="preserve">G-</w:t>
+      </w:r>
+      <w:r>
+        <w:t xml:space="preserve"> </w:t>
+      </w:r>
+      <w:r>
+        <w:t xml:space="preserve">après un score négatif. Contrairement à la sensibilité et à la spécificité, elles dépendent de la prévalence de</w:t>
+      </w:r>
+      <w:r>
+        <w:t xml:space="preserve"> </w:t>
+      </w:r>
+      <w:r>
+        <w:rPr>
+          <w:rStyle w:val="VerbatimChar"/>
+        </w:rPr>
+        <w:t xml:space="preserve">G+</w:t>
+      </w:r>
+      <w:r>
+        <w:t xml:space="preserve"> </w:t>
+      </w:r>
+      <w:r>
+        <w:t xml:space="preserve">dans cet échantillon et ne sont donc pas directement transposables à une population ayant une prévalence différente.</w:t>
       </w:r>
     </w:p>
     <w:p>

</xml_diff>